<commit_message>
feat: update project documentation with strict formatting
</commit_message>
<xml_diff>
--- a/Dokumentacja.docx
+++ b/Dokumentacja.docx
@@ -6,10 +6,71 @@
       <w:pPr>
         <w:jc w:val="center"/>
         <w:rPr>
+          <w:rFonts w:ascii="Calibri" w:hAnsi="Calibri" w:cs="Calibri"/>
+          <w:sz w:val="32"/>
+          <w:szCs w:val="32"/>
+        </w:rPr>
+      </w:pPr>
+      <w:r>
+        <w:rPr>
+          <w:rFonts w:ascii="Calibri" w:hAnsi="Calibri" w:cs="Calibri"/>
+          <w:sz w:val="32"/>
+          <w:szCs w:val="32"/>
+        </w:rPr>
+        <w:t>Uniwersytet WSB Merito Chorzów</w:t>
+      </w:r>
+    </w:p>
+    <w:p>
+      <w:pPr>
+        <w:jc w:val="center"/>
+        <w:rPr>
+          <w:rFonts w:ascii="Calibri" w:hAnsi="Calibri" w:cs="Calibri"/>
+        </w:rPr>
+      </w:pPr>
+      <w:r>
+        <w:rPr>
+          <w:rFonts w:ascii="Calibri" w:hAnsi="Calibri" w:cs="Calibri"/>
+        </w:rPr>
+        <w:t>Kierunek: Informatyka</w:t>
+      </w:r>
+    </w:p>
+    <w:p>
+      <w:pPr>
+        <w:jc w:val="center"/>
+        <w:rPr>
+          <w:rFonts w:ascii="Calibri" w:hAnsi="Calibri" w:cs="Calibri"/>
+        </w:rPr>
+      </w:pPr>
+      <w:r>
+        <w:rPr>
+          <w:rFonts w:ascii="Calibri" w:hAnsi="Calibri" w:cs="Calibri"/>
+        </w:rPr>
+        <w:t>Rok akademicki 2025/2026</w:t>
+      </w:r>
+    </w:p>
+    <w:p>
+      <w:pPr>
+        <w:jc w:val="center"/>
+        <w:rPr>
+          <w:rFonts w:ascii="Calibri" w:hAnsi="Calibri" w:cs="Calibri"/>
+        </w:rPr>
+      </w:pPr>
+      <w:r>
+        <w:rPr>
+          <w:rFonts w:ascii="Calibri" w:hAnsi="Calibri" w:cs="Calibri"/>
+        </w:rPr>
+        <w:t>I rok, semestr II</w:t>
+      </w:r>
+    </w:p>
+    <w:p>
+      <w:pPr>
+        <w:jc w:val="center"/>
+        <w:rPr>
+          <w:rFonts w:ascii="Calibri" w:hAnsi="Calibri" w:cs="Calibri"/>
           <w:b/>
           <w:bCs/>
-          <w:sz w:val="52"/>
-          <w:szCs w:val="52"/>
+          <w:sz w:val="32"/>
+          <w:szCs w:val="32"/>
         </w:rPr>
       </w:pPr>
     </w:p>
@@ -17,10 +78,11 @@
       <w:pPr>
         <w:jc w:val="center"/>
         <w:rPr>
+          <w:rFonts w:ascii="Calibri" w:hAnsi="Calibri" w:cs="Calibri"/>
           <w:b/>
           <w:bCs/>
-          <w:sz w:val="52"/>
-          <w:szCs w:val="52"/>
+          <w:sz w:val="32"/>
+          <w:szCs w:val="32"/>
         </w:rPr>
       </w:pPr>
     </w:p>
@@ -28,156 +90,336 @@
       <w:pPr>
         <w:jc w:val="center"/>
         <w:rPr>
+          <w:rFonts w:ascii="Calibri" w:hAnsi="Calibri" w:cs="Calibri"/>
           <w:b/>
           <w:bCs/>
-          <w:sz w:val="52"/>
-          <w:szCs w:val="52"/>
-        </w:rPr>
-      </w:pPr>
-    </w:p>
-    <w:p>
-      <w:pPr>
-        <w:jc w:val="center"/>
-        <w:rPr>
+          <w:sz w:val="48"/>
+          <w:szCs w:val="48"/>
+        </w:rPr>
+      </w:pPr>
+      <w:r>
+        <w:rPr>
+          <w:rFonts w:ascii="Calibri" w:hAnsi="Calibri" w:cs="Calibri"/>
           <w:b/>
           <w:bCs/>
-          <w:sz w:val="52"/>
-          <w:szCs w:val="52"/>
-        </w:rPr>
-      </w:pPr>
+          <w:sz w:val="48"/>
+          <w:szCs w:val="48"/>
+        </w:rPr>
+        <w:t>Projekt z Programowania Obiektowego</w:t>
+      </w:r>
     </w:p>
     <w:p>
       <w:pPr>
         <w:jc w:val="center"/>
         <w:rPr>
+          <w:rFonts w:ascii="Calibri" w:hAnsi="Calibri" w:cs="Calibri"/>
+        </w:rPr>
+      </w:pPr>
+      <w:r>
+        <w:rPr>
+          <w:rFonts w:ascii="Calibri" w:hAnsi="Calibri" w:cs="Calibri"/>
           <w:b/>
           <w:bCs/>
-          <w:sz w:val="52"/>
-          <w:szCs w:val="52"/>
-        </w:rPr>
-      </w:pPr>
-    </w:p>
-    <w:p>
-      <w:pPr>
-        <w:jc w:val="center"/>
-        <w:rPr>
+          <w:sz w:val="28"/>
+          <w:szCs w:val="28"/>
+        </w:rPr>
+        <w:t>Temat</w:t>
+      </w:r>
+      <w:r>
+        <w:rPr>
+          <w:rFonts w:ascii="Calibri" w:hAnsi="Calibri" w:cs="Calibri"/>
           <w:b/>
           <w:bCs/>
-          <w:sz w:val="52"/>
-          <w:szCs w:val="52"/>
-        </w:rPr>
-      </w:pPr>
-      <w:r>
-        <w:rPr>
-          <w:b/>
-          <w:bCs/>
-          <w:sz w:val="52"/>
-          <w:szCs w:val="52"/>
-        </w:rPr>
-        <w:t>Projekt z Programowania Obiektowego</w:t>
+          <w:sz w:val="28"/>
+          <w:szCs w:val="28"/>
+        </w:rPr>
+        <w:t xml:space="preserve"> projektu</w:t>
+      </w:r>
+      <w:r>
+        <w:rPr>
+          <w:rFonts w:ascii="Calibri" w:hAnsi="Calibri" w:cs="Calibri"/>
+        </w:rPr>
+        <w:t>:</w:t>
+      </w:r>
+      <w:r>
+        <w:rPr>
+          <w:rFonts w:ascii="Calibri" w:hAnsi="Calibri" w:cs="Calibri"/>
+        </w:rPr>
+        <w:t xml:space="preserve"> </w:t>
+      </w:r>
+      <w:r>
+        <w:rPr>
+          <w:rFonts w:ascii="Calibri" w:hAnsi="Calibri" w:cs="Calibri"/>
+          <w:sz w:val="28"/>
+          <w:szCs w:val="28"/>
+        </w:rPr>
+        <w:t>Hardware</w:t>
+      </w:r>
+      <w:r>
+        <w:rPr>
+          <w:rFonts w:ascii="Calibri" w:hAnsi="Calibri" w:cs="Calibri"/>
+          <w:sz w:val="28"/>
+          <w:szCs w:val="28"/>
+        </w:rPr>
+        <w:t xml:space="preserve"> </w:t>
+      </w:r>
+      <w:r>
+        <w:rPr>
+          <w:rFonts w:ascii="Calibri" w:hAnsi="Calibri" w:cs="Calibri"/>
+          <w:sz w:val="28"/>
+          <w:szCs w:val="28"/>
+        </w:rPr>
+        <w:t>Usage</w:t>
+      </w:r>
+      <w:r>
+        <w:rPr>
+          <w:rFonts w:ascii="Calibri" w:hAnsi="Calibri" w:cs="Calibri"/>
+          <w:sz w:val="28"/>
+          <w:szCs w:val="28"/>
+        </w:rPr>
+        <w:t xml:space="preserve"> </w:t>
+      </w:r>
+      <w:r>
+        <w:rPr>
+          <w:rFonts w:ascii="Calibri" w:hAnsi="Calibri" w:cs="Calibri"/>
+          <w:sz w:val="28"/>
+          <w:szCs w:val="28"/>
+        </w:rPr>
+        <w:t>Monitor</w:t>
+      </w:r>
+    </w:p>
+    <w:p>
+      <w:pPr>
+        <w:jc w:val="center"/>
+        <w:rPr>
+          <w:rFonts w:ascii="Calibri" w:hAnsi="Calibri" w:cs="Calibri"/>
+        </w:rPr>
+      </w:pPr>
+      <w:r>
+        <w:rPr>
+          <w:rFonts w:ascii="Calibri" w:hAnsi="Calibri" w:cs="Calibri"/>
+        </w:rPr>
+        <w:t xml:space="preserve"> </w:t>
+      </w:r>
+      <w:r>
+        <w:rPr>
+          <w:rFonts w:ascii="Calibri" w:hAnsi="Calibri" w:cs="Calibri"/>
+        </w:rPr>
+        <w:t>A</w:t>
+      </w:r>
+      <w:r>
+        <w:rPr>
+          <w:rFonts w:ascii="Calibri" w:hAnsi="Calibri" w:cs="Calibri"/>
+        </w:rPr>
+        <w:t>plikacja do monitorowania zasobów sprzętowyc</w:t>
+      </w:r>
+      <w:r>
+        <w:rPr>
+          <w:rFonts w:ascii="Calibri" w:hAnsi="Calibri" w:cs="Calibri"/>
+        </w:rPr>
+        <w:t>h</w:t>
+      </w:r>
+    </w:p>
+    <w:p>
+      <w:pPr>
+        <w:jc w:val="center"/>
+        <w:rPr>
+          <w:rFonts w:ascii="Calibri" w:hAnsi="Calibri" w:cs="Calibri"/>
+        </w:rPr>
+      </w:pPr>
+      <w:r>
+        <w:rPr>
+          <w:rFonts w:ascii="Calibri" w:hAnsi="Calibri" w:cs="Calibri"/>
+        </w:rPr>
+        <w:t>i zarządzania kontenerami Docker.</w:t>
       </w:r>
     </w:p>
     <w:p>
       <w:pPr>
         <w:jc w:val="both"/>
-      </w:pPr>
-      <w:r>
-        <w:t>Temat: Hardware Usage Monitor – aplikacja do monitorowania zasobów sprzętowych i zarządzania kontenerami Docker.</w:t>
-      </w:r>
+        <w:rPr>
+          <w:rFonts w:ascii="Calibri" w:hAnsi="Calibri" w:cs="Calibri"/>
+        </w:rPr>
+      </w:pPr>
     </w:p>
     <w:p>
       <w:pPr>
         <w:jc w:val="both"/>
+        <w:rPr>
+          <w:rFonts w:ascii="Calibri" w:hAnsi="Calibri" w:cs="Calibri"/>
+        </w:rPr>
       </w:pPr>
     </w:p>
     <w:p>
       <w:pPr>
         <w:jc w:val="both"/>
+        <w:rPr>
+          <w:rFonts w:ascii="Calibri" w:hAnsi="Calibri" w:cs="Calibri"/>
+        </w:rPr>
       </w:pPr>
     </w:p>
     <w:p>
       <w:pPr>
         <w:jc w:val="both"/>
+        <w:rPr>
+          <w:rFonts w:ascii="Calibri" w:hAnsi="Calibri" w:cs="Calibri"/>
+        </w:rPr>
       </w:pPr>
     </w:p>
     <w:p>
       <w:pPr>
         <w:jc w:val="both"/>
+        <w:rPr>
+          <w:rFonts w:ascii="Calibri" w:hAnsi="Calibri" w:cs="Calibri"/>
+        </w:rPr>
       </w:pPr>
     </w:p>
     <w:p>
       <w:pPr>
         <w:jc w:val="both"/>
+        <w:rPr>
+          <w:rFonts w:ascii="Calibri" w:hAnsi="Calibri" w:cs="Calibri"/>
+        </w:rPr>
       </w:pPr>
     </w:p>
     <w:p>
       <w:pPr>
         <w:jc w:val="both"/>
+        <w:rPr>
+          <w:rFonts w:ascii="Calibri" w:hAnsi="Calibri" w:cs="Calibri"/>
+        </w:rPr>
       </w:pPr>
     </w:p>
     <w:p>
       <w:pPr>
         <w:jc w:val="both"/>
+        <w:rPr>
+          <w:rFonts w:ascii="Calibri" w:hAnsi="Calibri" w:cs="Calibri"/>
+        </w:rPr>
       </w:pPr>
     </w:p>
     <w:p>
       <w:pPr>
         <w:jc w:val="both"/>
+        <w:rPr>
+          <w:rFonts w:ascii="Calibri" w:hAnsi="Calibri" w:cs="Calibri"/>
+        </w:rPr>
       </w:pPr>
     </w:p>
     <w:p>
       <w:pPr>
         <w:jc w:val="both"/>
+        <w:rPr>
+          <w:rFonts w:ascii="Calibri" w:hAnsi="Calibri" w:cs="Calibri"/>
+        </w:rPr>
       </w:pPr>
     </w:p>
     <w:p>
       <w:pPr>
         <w:jc w:val="both"/>
+        <w:rPr>
+          <w:rFonts w:ascii="Calibri" w:hAnsi="Calibri" w:cs="Calibri"/>
+        </w:rPr>
       </w:pPr>
     </w:p>
     <w:p>
       <w:pPr>
         <w:jc w:val="both"/>
+        <w:rPr>
+          <w:rFonts w:ascii="Calibri" w:hAnsi="Calibri" w:cs="Calibri"/>
+        </w:rPr>
       </w:pPr>
     </w:p>
     <w:p>
       <w:pPr>
         <w:jc w:val="both"/>
-      </w:pPr>
-    </w:p>
-    <w:p>
-      <w:pPr>
-        <w:jc w:val="both"/>
-      </w:pPr>
-    </w:p>
-    <w:p>
-      <w:pPr>
-        <w:jc w:val="both"/>
-      </w:pPr>
-    </w:p>
-    <w:p>
-      <w:pPr>
-        <w:jc w:val="right"/>
-      </w:pPr>
-      <w:r>
-        <w:t xml:space="preserve">Igor Dybał, </w:t>
-      </w:r>
-      <w:r>
+        <w:rPr>
+          <w:rFonts w:ascii="Calibri" w:hAnsi="Calibri" w:cs="Calibri"/>
+        </w:rPr>
+      </w:pPr>
+    </w:p>
+    <w:p>
+      <w:pPr>
+        <w:jc w:val="center"/>
+        <w:rPr>
+          <w:rFonts w:ascii="Calibri" w:hAnsi="Calibri" w:cs="Calibri"/>
+        </w:rPr>
+      </w:pPr>
+      <w:r>
+        <w:rPr>
+          <w:rFonts w:ascii="Calibri" w:hAnsi="Calibri" w:cs="Calibri"/>
+        </w:rPr>
+        <w:t>Igor Dybał</w:t>
+      </w:r>
+      <w:r>
+        <w:rPr>
+          <w:rFonts w:ascii="Calibri" w:hAnsi="Calibri" w:cs="Calibri"/>
+        </w:rPr>
+        <w:t>, nr indeksu</w:t>
+      </w:r>
+      <w:r>
+        <w:rPr>
+          <w:rFonts w:ascii="Calibri" w:hAnsi="Calibri" w:cs="Calibri"/>
+        </w:rPr>
+        <w:t xml:space="preserve"> </w:t>
+      </w:r>
+      <w:r>
+        <w:rPr>
+          <w:rFonts w:ascii="Calibri" w:hAnsi="Calibri" w:cs="Calibri"/>
+        </w:rPr>
         <w:t>183593</w:t>
       </w:r>
     </w:p>
     <w:p>
       <w:pPr>
-        <w:jc w:val="right"/>
-      </w:pPr>
-      <w:r>
-        <w:t>Łukasz Frydrych,</w:t>
+        <w:jc w:val="center"/>
+        <w:rPr>
+          <w:rFonts w:ascii="Calibri" w:hAnsi="Calibri" w:cs="Calibri"/>
+        </w:rPr>
+      </w:pPr>
+      <w:r>
+        <w:rPr>
+          <w:rFonts w:ascii="Calibri" w:hAnsi="Calibri" w:cs="Calibri"/>
+        </w:rPr>
+        <w:t>Łukasz Frydrych</w:t>
+      </w:r>
+      <w:r>
+        <w:rPr>
+          <w:rFonts w:ascii="Calibri" w:hAnsi="Calibri" w:cs="Calibri"/>
+        </w:rPr>
+        <w:t>, nr indeksu</w:t>
+      </w:r>
+      <w:r>
+        <w:rPr>
+          <w:rFonts w:ascii="Calibri" w:hAnsi="Calibri" w:cs="Calibri"/>
+        </w:rPr>
+        <w:t xml:space="preserve"> </w:t>
+      </w:r>
+      <w:r>
+        <w:rPr>
+          <w:rFonts w:ascii="Calibri" w:hAnsi="Calibri" w:cs="Calibri"/>
+        </w:rPr>
+        <w:t>183596</w:t>
+      </w:r>
+    </w:p>
+    <w:p>
+      <w:pPr>
+        <w:jc w:val="center"/>
+        <w:rPr>
+          <w:rFonts w:ascii="Calibri" w:hAnsi="Calibri" w:cs="Calibri"/>
+        </w:rPr>
+      </w:pPr>
+      <w:r>
+        <w:rPr>
+          <w:rFonts w:ascii="Calibri" w:hAnsi="Calibri" w:cs="Calibri"/>
+        </w:rPr>
+        <w:t>Chorzów, 2026</w:t>
       </w:r>
     </w:p>
     <w:sdt>
       <w:sdtPr>
         <w:rPr>
-          <w:rFonts w:asciiTheme="minorHAnsi" w:eastAsiaTheme="minorHAnsi" w:hAnsiTheme="minorHAnsi" w:cstheme="minorBidi"/>
+          <w:rFonts w:ascii="Calibri" w:eastAsiaTheme="minorHAnsi" w:hAnsi="Calibri" w:cs="Calibri"/>
           <w:color w:val="auto"/>
           <w:kern w:val="2"/>
           <w:sz w:val="24"/>
@@ -204,11 +446,13 @@
             <w:pStyle w:val="TOCHeading"/>
             <w:jc w:val="both"/>
             <w:rPr>
+              <w:rFonts w:ascii="Calibri" w:hAnsi="Calibri" w:cs="Calibri"/>
               <w:lang w:val="pl-PL"/>
             </w:rPr>
           </w:pPr>
           <w:r>
             <w:rPr>
+              <w:rFonts w:ascii="Calibri" w:hAnsi="Calibri" w:cs="Calibri"/>
               <w:lang w:val="pl-PL"/>
             </w:rPr>
             <w:t>Spis treści</w:t>
@@ -222,120 +466,96 @@
               <w:tab w:val="right" w:leader="dot" w:pos="9062"/>
             </w:tabs>
             <w:rPr>
-              <w:ins w:id="0" w:author="Igor 183593" w:date="2026-06-09T17:17:00Z" w16du:dateUtc="2026-06-09T15:17:00Z"/>
-              <w:rFonts w:eastAsiaTheme="minorEastAsia"/>
+              <w:rFonts w:ascii="Calibri" w:eastAsiaTheme="minorEastAsia" w:hAnsi="Calibri" w:cs="Calibri"/>
               <w:noProof/>
               <w:lang w:eastAsia="pl-PL"/>
             </w:rPr>
           </w:pPr>
           <w:r>
+            <w:rPr>
+              <w:rFonts w:ascii="Calibri" w:hAnsi="Calibri" w:cs="Calibri"/>
+            </w:rPr>
             <w:fldChar w:fldCharType="begin"/>
           </w:r>
           <w:r>
+            <w:rPr>
+              <w:rFonts w:ascii="Calibri" w:hAnsi="Calibri" w:cs="Calibri"/>
+            </w:rPr>
             <w:instrText xml:space="preserve"> TOC \o "1-3" \h \z \u </w:instrText>
           </w:r>
           <w:r>
+            <w:rPr>
+              <w:rFonts w:ascii="Calibri" w:hAnsi="Calibri" w:cs="Calibri"/>
+            </w:rPr>
             <w:fldChar w:fldCharType="separate"/>
           </w:r>
-          <w:ins w:id="1" w:author="Igor 183593" w:date="2026-06-09T17:17:00Z" w16du:dateUtc="2026-06-09T15:17:00Z">
+          <w:hyperlink w:anchor="_Toc231917839" w:history="1">
             <w:r>
               <w:rPr>
                 <w:rStyle w:val="Hyperlink"/>
-                <w:noProof/>
+                <w:rFonts w:ascii="Calibri" w:hAnsi="Calibri" w:cs="Calibri"/>
+                <w:noProof/>
+              </w:rPr>
+              <w:t>1.</w:t>
+            </w:r>
+            <w:r>
+              <w:rPr>
+                <w:rFonts w:ascii="Calibri" w:eastAsiaTheme="minorEastAsia" w:hAnsi="Calibri" w:cs="Calibri"/>
+                <w:noProof/>
+                <w:lang w:eastAsia="pl-PL"/>
+              </w:rPr>
+              <w:tab/>
+            </w:r>
+            <w:r>
+              <w:rPr>
+                <w:rStyle w:val="Hyperlink"/>
+                <w:rFonts w:ascii="Calibri" w:hAnsi="Calibri" w:cs="Calibri"/>
+                <w:noProof/>
+              </w:rPr>
+              <w:t>Opis i założenia projektu</w:t>
+            </w:r>
+            <w:r>
+              <w:rPr>
+                <w:rFonts w:ascii="Calibri" w:hAnsi="Calibri" w:cs="Calibri"/>
+                <w:noProof/>
+                <w:webHidden/>
+              </w:rPr>
+              <w:tab/>
+            </w:r>
+            <w:r>
+              <w:rPr>
+                <w:rFonts w:ascii="Calibri" w:hAnsi="Calibri" w:cs="Calibri"/>
+                <w:noProof/>
+                <w:webHidden/>
               </w:rPr>
               <w:fldChar w:fldCharType="begin"/>
             </w:r>
             <w:r>
               <w:rPr>
-                <w:rStyle w:val="Hyperlink"/>
-                <w:noProof/>
-              </w:rPr>
-              <w:instrText xml:space="preserve"> </w:instrText>
-            </w:r>
-            <w:r>
-              <w:rPr>
-                <w:noProof/>
-              </w:rPr>
-              <w:instrText>HYPERLINK \l "_Toc231917839"</w:instrText>
-            </w:r>
-            <w:r>
-              <w:rPr>
-                <w:rStyle w:val="Hyperlink"/>
-                <w:noProof/>
-              </w:rPr>
-              <w:instrText xml:space="preserve"> </w:instrText>
-            </w:r>
-            <w:r>
-              <w:rPr>
-                <w:rStyle w:val="Hyperlink"/>
-                <w:noProof/>
-              </w:rPr>
-            </w:r>
-            <w:r>
-              <w:rPr>
-                <w:rStyle w:val="Hyperlink"/>
-                <w:noProof/>
+                <w:rFonts w:ascii="Calibri" w:hAnsi="Calibri" w:cs="Calibri"/>
+                <w:noProof/>
+                <w:webHidden/>
+              </w:rPr>
+              <w:instrText xml:space="preserve"> PAGEREF _Toc231917839 \h </w:instrText>
+            </w:r>
+            <w:r>
+              <w:rPr>
+                <w:rFonts w:ascii="Calibri" w:hAnsi="Calibri" w:cs="Calibri"/>
+                <w:noProof/>
+                <w:webHidden/>
+              </w:rPr>
+            </w:r>
+            <w:r>
+              <w:rPr>
+                <w:rFonts w:ascii="Calibri" w:hAnsi="Calibri" w:cs="Calibri"/>
+                <w:noProof/>
+                <w:webHidden/>
               </w:rPr>
               <w:fldChar w:fldCharType="separate"/>
             </w:r>
             <w:r>
               <w:rPr>
-                <w:rStyle w:val="Hyperlink"/>
-                <w:noProof/>
-              </w:rPr>
-              <w:t>1.</w:t>
-            </w:r>
-            <w:r>
-              <w:rPr>
-                <w:rFonts w:eastAsiaTheme="minorEastAsia"/>
-                <w:noProof/>
-                <w:lang w:eastAsia="pl-PL"/>
-              </w:rPr>
-              <w:tab/>
-            </w:r>
-            <w:r>
-              <w:rPr>
-                <w:rStyle w:val="Hyperlink"/>
-                <w:noProof/>
-              </w:rPr>
-              <w:t>Opis i założenia projektu</w:t>
-            </w:r>
-            <w:r>
-              <w:rPr>
-                <w:noProof/>
-                <w:webHidden/>
-              </w:rPr>
-              <w:tab/>
-            </w:r>
-            <w:r>
-              <w:rPr>
-                <w:noProof/>
-                <w:webHidden/>
-              </w:rPr>
-              <w:fldChar w:fldCharType="begin"/>
-            </w:r>
-            <w:r>
-              <w:rPr>
-                <w:noProof/>
-                <w:webHidden/>
-              </w:rPr>
-              <w:instrText xml:space="preserve"> PAGEREF _Toc231917839 \h </w:instrText>
-            </w:r>
-            <w:r>
-              <w:rPr>
-                <w:noProof/>
-                <w:webHidden/>
-              </w:rPr>
-            </w:r>
-            <w:r>
-              <w:rPr>
-                <w:noProof/>
-                <w:webHidden/>
-              </w:rPr>
-              <w:fldChar w:fldCharType="separate"/>
-            </w:r>
-            <w:r>
-              <w:rPr>
+                <w:rFonts w:ascii="Calibri" w:hAnsi="Calibri" w:cs="Calibri"/>
                 <w:noProof/>
                 <w:webHidden/>
               </w:rPr>
@@ -343,19 +563,13 @@
             </w:r>
             <w:r>
               <w:rPr>
+                <w:rFonts w:ascii="Calibri" w:hAnsi="Calibri" w:cs="Calibri"/>
                 <w:noProof/>
                 <w:webHidden/>
               </w:rPr>
               <w:fldChar w:fldCharType="end"/>
             </w:r>
-            <w:r>
-              <w:rPr>
-                <w:rStyle w:val="Hyperlink"/>
-                <w:noProof/>
-              </w:rPr>
-              <w:fldChar w:fldCharType="end"/>
-            </w:r>
-          </w:ins>
+          </w:hyperlink>
         </w:p>
         <w:p>
           <w:pPr>
@@ -365,111 +579,78 @@
               <w:tab w:val="right" w:leader="dot" w:pos="9062"/>
             </w:tabs>
             <w:rPr>
-              <w:ins w:id="2" w:author="Igor 183593" w:date="2026-06-09T17:17:00Z" w16du:dateUtc="2026-06-09T15:17:00Z"/>
-              <w:rFonts w:eastAsiaTheme="minorEastAsia"/>
+              <w:rFonts w:ascii="Calibri" w:eastAsiaTheme="minorEastAsia" w:hAnsi="Calibri" w:cs="Calibri"/>
               <w:noProof/>
               <w:lang w:eastAsia="pl-PL"/>
             </w:rPr>
           </w:pPr>
-          <w:ins w:id="3" w:author="Igor 183593" w:date="2026-06-09T17:17:00Z" w16du:dateUtc="2026-06-09T15:17:00Z">
+          <w:hyperlink w:anchor="_Toc231917840" w:history="1">
             <w:r>
               <w:rPr>
                 <w:rStyle w:val="Hyperlink"/>
-                <w:noProof/>
+                <w:rFonts w:ascii="Calibri" w:hAnsi="Calibri" w:cs="Calibri"/>
+                <w:noProof/>
+              </w:rPr>
+              <w:t>2.</w:t>
+            </w:r>
+            <w:r>
+              <w:rPr>
+                <w:rFonts w:ascii="Calibri" w:eastAsiaTheme="minorEastAsia" w:hAnsi="Calibri" w:cs="Calibri"/>
+                <w:noProof/>
+                <w:lang w:eastAsia="pl-PL"/>
+              </w:rPr>
+              <w:tab/>
+            </w:r>
+            <w:r>
+              <w:rPr>
+                <w:rStyle w:val="Hyperlink"/>
+                <w:rFonts w:ascii="Calibri" w:hAnsi="Calibri" w:cs="Calibri"/>
+                <w:noProof/>
+              </w:rPr>
+              <w:t>Opis techniczny projektu</w:t>
+            </w:r>
+            <w:r>
+              <w:rPr>
+                <w:rFonts w:ascii="Calibri" w:hAnsi="Calibri" w:cs="Calibri"/>
+                <w:noProof/>
+                <w:webHidden/>
+              </w:rPr>
+              <w:tab/>
+            </w:r>
+            <w:r>
+              <w:rPr>
+                <w:rFonts w:ascii="Calibri" w:hAnsi="Calibri" w:cs="Calibri"/>
+                <w:noProof/>
+                <w:webHidden/>
               </w:rPr>
               <w:fldChar w:fldCharType="begin"/>
             </w:r>
             <w:r>
               <w:rPr>
-                <w:rStyle w:val="Hyperlink"/>
-                <w:noProof/>
-              </w:rPr>
-              <w:instrText xml:space="preserve"> </w:instrText>
-            </w:r>
-            <w:r>
-              <w:rPr>
-                <w:noProof/>
-              </w:rPr>
-              <w:instrText>HYPERLINK \l "_Toc231917840"</w:instrText>
-            </w:r>
-            <w:r>
-              <w:rPr>
-                <w:rStyle w:val="Hyperlink"/>
-                <w:noProof/>
-              </w:rPr>
-              <w:instrText xml:space="preserve"> </w:instrText>
-            </w:r>
-            <w:r>
-              <w:rPr>
-                <w:rStyle w:val="Hyperlink"/>
-                <w:noProof/>
-              </w:rPr>
-            </w:r>
-            <w:r>
-              <w:rPr>
-                <w:rStyle w:val="Hyperlink"/>
-                <w:noProof/>
+                <w:rFonts w:ascii="Calibri" w:hAnsi="Calibri" w:cs="Calibri"/>
+                <w:noProof/>
+                <w:webHidden/>
+              </w:rPr>
+              <w:instrText xml:space="preserve"> PAGEREF _Toc231917840 \h </w:instrText>
+            </w:r>
+            <w:r>
+              <w:rPr>
+                <w:rFonts w:ascii="Calibri" w:hAnsi="Calibri" w:cs="Calibri"/>
+                <w:noProof/>
+                <w:webHidden/>
+              </w:rPr>
+            </w:r>
+            <w:r>
+              <w:rPr>
+                <w:rFonts w:ascii="Calibri" w:hAnsi="Calibri" w:cs="Calibri"/>
+                <w:noProof/>
+                <w:webHidden/>
               </w:rPr>
               <w:fldChar w:fldCharType="separate"/>
             </w:r>
             <w:r>
               <w:rPr>
-                <w:rStyle w:val="Hyperlink"/>
-                <w:noProof/>
-              </w:rPr>
-              <w:t>2.</w:t>
-            </w:r>
-            <w:r>
-              <w:rPr>
-                <w:rFonts w:eastAsiaTheme="minorEastAsia"/>
-                <w:noProof/>
-                <w:lang w:eastAsia="pl-PL"/>
-              </w:rPr>
-              <w:tab/>
-            </w:r>
-            <w:r>
-              <w:rPr>
-                <w:rStyle w:val="Hyperlink"/>
-                <w:noProof/>
-              </w:rPr>
-              <w:t>Opis techniczny projektu</w:t>
-            </w:r>
-            <w:r>
-              <w:rPr>
-                <w:noProof/>
-                <w:webHidden/>
-              </w:rPr>
-              <w:tab/>
-            </w:r>
-            <w:r>
-              <w:rPr>
-                <w:noProof/>
-                <w:webHidden/>
-              </w:rPr>
-              <w:fldChar w:fldCharType="begin"/>
-            </w:r>
-            <w:r>
-              <w:rPr>
-                <w:noProof/>
-                <w:webHidden/>
-              </w:rPr>
-              <w:instrText xml:space="preserve"> PAGEREF _Toc231917840 \h </w:instrText>
-            </w:r>
-            <w:r>
-              <w:rPr>
-                <w:noProof/>
-                <w:webHidden/>
-              </w:rPr>
-            </w:r>
-            <w:r>
-              <w:rPr>
-                <w:noProof/>
-                <w:webHidden/>
-              </w:rPr>
-              <w:fldChar w:fldCharType="separate"/>
-            </w:r>
-            <w:r>
-              <w:rPr>
+                <w:rFonts w:ascii="Calibri" w:hAnsi="Calibri" w:cs="Calibri"/>
                 <w:noProof/>
                 <w:webHidden/>
               </w:rPr>
@@ -477,19 +658,13 @@
             </w:r>
             <w:r>
               <w:rPr>
+                <w:rFonts w:ascii="Calibri" w:hAnsi="Calibri" w:cs="Calibri"/>
                 <w:noProof/>
                 <w:webHidden/>
               </w:rPr>
               <w:fldChar w:fldCharType="end"/>
             </w:r>
-            <w:r>
-              <w:rPr>
-                <w:rStyle w:val="Hyperlink"/>
-                <w:noProof/>
-              </w:rPr>
-              <w:fldChar w:fldCharType="end"/>
-            </w:r>
-          </w:ins>
+          </w:hyperlink>
         </w:p>
         <w:p>
           <w:pPr>
@@ -499,111 +674,78 @@
               <w:tab w:val="right" w:leader="dot" w:pos="9062"/>
             </w:tabs>
             <w:rPr>
-              <w:ins w:id="4" w:author="Igor 183593" w:date="2026-06-09T17:17:00Z" w16du:dateUtc="2026-06-09T15:17:00Z"/>
-              <w:rFonts w:eastAsiaTheme="minorEastAsia"/>
+              <w:rFonts w:ascii="Calibri" w:eastAsiaTheme="minorEastAsia" w:hAnsi="Calibri" w:cs="Calibri"/>
               <w:noProof/>
               <w:lang w:eastAsia="pl-PL"/>
             </w:rPr>
           </w:pPr>
-          <w:ins w:id="5" w:author="Igor 183593" w:date="2026-06-09T17:17:00Z" w16du:dateUtc="2026-06-09T15:17:00Z">
+          <w:hyperlink w:anchor="_Toc231917841" w:history="1">
             <w:r>
               <w:rPr>
                 <w:rStyle w:val="Hyperlink"/>
-                <w:noProof/>
+                <w:rFonts w:ascii="Calibri" w:hAnsi="Calibri" w:cs="Calibri"/>
+                <w:noProof/>
+              </w:rPr>
+              <w:t>2.1.</w:t>
+            </w:r>
+            <w:r>
+              <w:rPr>
+                <w:rFonts w:ascii="Calibri" w:eastAsiaTheme="minorEastAsia" w:hAnsi="Calibri" w:cs="Calibri"/>
+                <w:noProof/>
+                <w:lang w:eastAsia="pl-PL"/>
+              </w:rPr>
+              <w:tab/>
+            </w:r>
+            <w:r>
+              <w:rPr>
+                <w:rStyle w:val="Hyperlink"/>
+                <w:rFonts w:ascii="Calibri" w:hAnsi="Calibri" w:cs="Calibri"/>
+                <w:noProof/>
+              </w:rPr>
+              <w:t>Interfejsy</w:t>
+            </w:r>
+            <w:r>
+              <w:rPr>
+                <w:rFonts w:ascii="Calibri" w:hAnsi="Calibri" w:cs="Calibri"/>
+                <w:noProof/>
+                <w:webHidden/>
+              </w:rPr>
+              <w:tab/>
+            </w:r>
+            <w:r>
+              <w:rPr>
+                <w:rFonts w:ascii="Calibri" w:hAnsi="Calibri" w:cs="Calibri"/>
+                <w:noProof/>
+                <w:webHidden/>
               </w:rPr>
               <w:fldChar w:fldCharType="begin"/>
             </w:r>
             <w:r>
               <w:rPr>
-                <w:rStyle w:val="Hyperlink"/>
-                <w:noProof/>
-              </w:rPr>
-              <w:instrText xml:space="preserve"> </w:instrText>
-            </w:r>
-            <w:r>
-              <w:rPr>
-                <w:noProof/>
-              </w:rPr>
-              <w:instrText>HYPERLINK \l "_Toc231917841"</w:instrText>
-            </w:r>
-            <w:r>
-              <w:rPr>
-                <w:rStyle w:val="Hyperlink"/>
-                <w:noProof/>
-              </w:rPr>
-              <w:instrText xml:space="preserve"> </w:instrText>
-            </w:r>
-            <w:r>
-              <w:rPr>
-                <w:rStyle w:val="Hyperlink"/>
-                <w:noProof/>
-              </w:rPr>
-            </w:r>
-            <w:r>
-              <w:rPr>
-                <w:rStyle w:val="Hyperlink"/>
-                <w:noProof/>
+                <w:rFonts w:ascii="Calibri" w:hAnsi="Calibri" w:cs="Calibri"/>
+                <w:noProof/>
+                <w:webHidden/>
+              </w:rPr>
+              <w:instrText xml:space="preserve"> PAGEREF _Toc231917841 \h </w:instrText>
+            </w:r>
+            <w:r>
+              <w:rPr>
+                <w:rFonts w:ascii="Calibri" w:hAnsi="Calibri" w:cs="Calibri"/>
+                <w:noProof/>
+                <w:webHidden/>
+              </w:rPr>
+            </w:r>
+            <w:r>
+              <w:rPr>
+                <w:rFonts w:ascii="Calibri" w:hAnsi="Calibri" w:cs="Calibri"/>
+                <w:noProof/>
+                <w:webHidden/>
               </w:rPr>
               <w:fldChar w:fldCharType="separate"/>
             </w:r>
             <w:r>
               <w:rPr>
-                <w:rStyle w:val="Hyperlink"/>
-                <w:noProof/>
-              </w:rPr>
-              <w:t>2.1.</w:t>
-            </w:r>
-            <w:r>
-              <w:rPr>
-                <w:rFonts w:eastAsiaTheme="minorEastAsia"/>
-                <w:noProof/>
-                <w:lang w:eastAsia="pl-PL"/>
-              </w:rPr>
-              <w:tab/>
-            </w:r>
-            <w:r>
-              <w:rPr>
-                <w:rStyle w:val="Hyperlink"/>
-                <w:noProof/>
-              </w:rPr>
-              <w:t>Interfejsy</w:t>
-            </w:r>
-            <w:r>
-              <w:rPr>
-                <w:noProof/>
-                <w:webHidden/>
-              </w:rPr>
-              <w:tab/>
-            </w:r>
-            <w:r>
-              <w:rPr>
-                <w:noProof/>
-                <w:webHidden/>
-              </w:rPr>
-              <w:fldChar w:fldCharType="begin"/>
-            </w:r>
-            <w:r>
-              <w:rPr>
-                <w:noProof/>
-                <w:webHidden/>
-              </w:rPr>
-              <w:instrText xml:space="preserve"> PAGEREF _Toc231917841 \h </w:instrText>
-            </w:r>
-            <w:r>
-              <w:rPr>
-                <w:noProof/>
-                <w:webHidden/>
-              </w:rPr>
-            </w:r>
-            <w:r>
-              <w:rPr>
-                <w:noProof/>
-                <w:webHidden/>
-              </w:rPr>
-              <w:fldChar w:fldCharType="separate"/>
-            </w:r>
-            <w:r>
-              <w:rPr>
+                <w:rFonts w:ascii="Calibri" w:hAnsi="Calibri" w:cs="Calibri"/>
                 <w:noProof/>
                 <w:webHidden/>
               </w:rPr>
@@ -611,19 +753,13 @@
             </w:r>
             <w:r>
               <w:rPr>
+                <w:rFonts w:ascii="Calibri" w:hAnsi="Calibri" w:cs="Calibri"/>
                 <w:noProof/>
                 <w:webHidden/>
               </w:rPr>
               <w:fldChar w:fldCharType="end"/>
             </w:r>
-            <w:r>
-              <w:rPr>
-                <w:rStyle w:val="Hyperlink"/>
-                <w:noProof/>
-              </w:rPr>
-              <w:fldChar w:fldCharType="end"/>
-            </w:r>
-          </w:ins>
+          </w:hyperlink>
         </w:p>
         <w:p>
           <w:pPr>
@@ -633,111 +769,78 @@
               <w:tab w:val="right" w:leader="dot" w:pos="9062"/>
             </w:tabs>
             <w:rPr>
-              <w:ins w:id="6" w:author="Igor 183593" w:date="2026-06-09T17:17:00Z" w16du:dateUtc="2026-06-09T15:17:00Z"/>
-              <w:rFonts w:eastAsiaTheme="minorEastAsia"/>
+              <w:rFonts w:ascii="Calibri" w:eastAsiaTheme="minorEastAsia" w:hAnsi="Calibri" w:cs="Calibri"/>
               <w:noProof/>
               <w:lang w:eastAsia="pl-PL"/>
             </w:rPr>
           </w:pPr>
-          <w:ins w:id="7" w:author="Igor 183593" w:date="2026-06-09T17:17:00Z" w16du:dateUtc="2026-06-09T15:17:00Z">
+          <w:hyperlink w:anchor="_Toc231917842" w:history="1">
             <w:r>
               <w:rPr>
                 <w:rStyle w:val="Hyperlink"/>
-                <w:noProof/>
+                <w:rFonts w:ascii="Calibri" w:hAnsi="Calibri" w:cs="Calibri"/>
+                <w:noProof/>
+              </w:rPr>
+              <w:t>2.2.</w:t>
+            </w:r>
+            <w:r>
+              <w:rPr>
+                <w:rFonts w:ascii="Calibri" w:eastAsiaTheme="minorEastAsia" w:hAnsi="Calibri" w:cs="Calibri"/>
+                <w:noProof/>
+                <w:lang w:eastAsia="pl-PL"/>
+              </w:rPr>
+              <w:tab/>
+            </w:r>
+            <w:r>
+              <w:rPr>
+                <w:rStyle w:val="Hyperlink"/>
+                <w:rFonts w:ascii="Calibri" w:hAnsi="Calibri" w:cs="Calibri"/>
+                <w:noProof/>
+              </w:rPr>
+              <w:t>Klasy</w:t>
+            </w:r>
+            <w:r>
+              <w:rPr>
+                <w:rFonts w:ascii="Calibri" w:hAnsi="Calibri" w:cs="Calibri"/>
+                <w:noProof/>
+                <w:webHidden/>
+              </w:rPr>
+              <w:tab/>
+            </w:r>
+            <w:r>
+              <w:rPr>
+                <w:rFonts w:ascii="Calibri" w:hAnsi="Calibri" w:cs="Calibri"/>
+                <w:noProof/>
+                <w:webHidden/>
               </w:rPr>
               <w:fldChar w:fldCharType="begin"/>
             </w:r>
             <w:r>
               <w:rPr>
-                <w:rStyle w:val="Hyperlink"/>
-                <w:noProof/>
-              </w:rPr>
-              <w:instrText xml:space="preserve"> </w:instrText>
-            </w:r>
-            <w:r>
-              <w:rPr>
-                <w:noProof/>
-              </w:rPr>
-              <w:instrText>HYPERLINK \l "_Toc231917842"</w:instrText>
-            </w:r>
-            <w:r>
-              <w:rPr>
-                <w:rStyle w:val="Hyperlink"/>
-                <w:noProof/>
-              </w:rPr>
-              <w:instrText xml:space="preserve"> </w:instrText>
-            </w:r>
-            <w:r>
-              <w:rPr>
-                <w:rStyle w:val="Hyperlink"/>
-                <w:noProof/>
-              </w:rPr>
-            </w:r>
-            <w:r>
-              <w:rPr>
-                <w:rStyle w:val="Hyperlink"/>
-                <w:noProof/>
+                <w:rFonts w:ascii="Calibri" w:hAnsi="Calibri" w:cs="Calibri"/>
+                <w:noProof/>
+                <w:webHidden/>
+              </w:rPr>
+              <w:instrText xml:space="preserve"> PAGEREF _Toc231917842 \h </w:instrText>
+            </w:r>
+            <w:r>
+              <w:rPr>
+                <w:rFonts w:ascii="Calibri" w:hAnsi="Calibri" w:cs="Calibri"/>
+                <w:noProof/>
+                <w:webHidden/>
+              </w:rPr>
+            </w:r>
+            <w:r>
+              <w:rPr>
+                <w:rFonts w:ascii="Calibri" w:hAnsi="Calibri" w:cs="Calibri"/>
+                <w:noProof/>
+                <w:webHidden/>
               </w:rPr>
               <w:fldChar w:fldCharType="separate"/>
             </w:r>
             <w:r>
               <w:rPr>
-                <w:rStyle w:val="Hyperlink"/>
-                <w:noProof/>
-              </w:rPr>
-              <w:t>2.2.</w:t>
-            </w:r>
-            <w:r>
-              <w:rPr>
-                <w:rFonts w:eastAsiaTheme="minorEastAsia"/>
-                <w:noProof/>
-                <w:lang w:eastAsia="pl-PL"/>
-              </w:rPr>
-              <w:tab/>
-            </w:r>
-            <w:r>
-              <w:rPr>
-                <w:rStyle w:val="Hyperlink"/>
-                <w:noProof/>
-              </w:rPr>
-              <w:t>Klasy</w:t>
-            </w:r>
-            <w:r>
-              <w:rPr>
-                <w:noProof/>
-                <w:webHidden/>
-              </w:rPr>
-              <w:tab/>
-            </w:r>
-            <w:r>
-              <w:rPr>
-                <w:noProof/>
-                <w:webHidden/>
-              </w:rPr>
-              <w:fldChar w:fldCharType="begin"/>
-            </w:r>
-            <w:r>
-              <w:rPr>
-                <w:noProof/>
-                <w:webHidden/>
-              </w:rPr>
-              <w:instrText xml:space="preserve"> PAGEREF _Toc231917842 \h </w:instrText>
-            </w:r>
-            <w:r>
-              <w:rPr>
-                <w:noProof/>
-                <w:webHidden/>
-              </w:rPr>
-            </w:r>
-            <w:r>
-              <w:rPr>
-                <w:noProof/>
-                <w:webHidden/>
-              </w:rPr>
-              <w:fldChar w:fldCharType="separate"/>
-            </w:r>
-            <w:r>
-              <w:rPr>
+                <w:rFonts w:ascii="Calibri" w:hAnsi="Calibri" w:cs="Calibri"/>
                 <w:noProof/>
                 <w:webHidden/>
               </w:rPr>
@@ -745,19 +848,13 @@
             </w:r>
             <w:r>
               <w:rPr>
+                <w:rFonts w:ascii="Calibri" w:hAnsi="Calibri" w:cs="Calibri"/>
                 <w:noProof/>
                 <w:webHidden/>
               </w:rPr>
               <w:fldChar w:fldCharType="end"/>
             </w:r>
-            <w:r>
-              <w:rPr>
-                <w:rStyle w:val="Hyperlink"/>
-                <w:noProof/>
-              </w:rPr>
-              <w:fldChar w:fldCharType="end"/>
-            </w:r>
-          </w:ins>
+          </w:hyperlink>
         </w:p>
         <w:p>
           <w:pPr>
@@ -767,111 +864,78 @@
               <w:tab w:val="right" w:leader="dot" w:pos="9062"/>
             </w:tabs>
             <w:rPr>
-              <w:ins w:id="8" w:author="Igor 183593" w:date="2026-06-09T17:17:00Z" w16du:dateUtc="2026-06-09T15:17:00Z"/>
-              <w:rFonts w:eastAsiaTheme="minorEastAsia"/>
+              <w:rFonts w:ascii="Calibri" w:eastAsiaTheme="minorEastAsia" w:hAnsi="Calibri" w:cs="Calibri"/>
               <w:noProof/>
               <w:lang w:eastAsia="pl-PL"/>
             </w:rPr>
           </w:pPr>
-          <w:ins w:id="9" w:author="Igor 183593" w:date="2026-06-09T17:17:00Z" w16du:dateUtc="2026-06-09T15:17:00Z">
+          <w:hyperlink w:anchor="_Toc231917843" w:history="1">
             <w:r>
               <w:rPr>
                 <w:rStyle w:val="Hyperlink"/>
-                <w:noProof/>
+                <w:rFonts w:ascii="Calibri" w:hAnsi="Calibri" w:cs="Calibri"/>
+                <w:noProof/>
+              </w:rPr>
+              <w:t>2.3.</w:t>
+            </w:r>
+            <w:r>
+              <w:rPr>
+                <w:rFonts w:ascii="Calibri" w:eastAsiaTheme="minorEastAsia" w:hAnsi="Calibri" w:cs="Calibri"/>
+                <w:noProof/>
+                <w:lang w:eastAsia="pl-PL"/>
+              </w:rPr>
+              <w:tab/>
+            </w:r>
+            <w:r>
+              <w:rPr>
+                <w:rStyle w:val="Hyperlink"/>
+                <w:rFonts w:ascii="Calibri" w:hAnsi="Calibri" w:cs="Calibri"/>
+                <w:noProof/>
+              </w:rPr>
+              <w:t>Klasy</w:t>
+            </w:r>
+            <w:r>
+              <w:rPr>
+                <w:rFonts w:ascii="Calibri" w:hAnsi="Calibri" w:cs="Calibri"/>
+                <w:noProof/>
+                <w:webHidden/>
+              </w:rPr>
+              <w:tab/>
+            </w:r>
+            <w:r>
+              <w:rPr>
+                <w:rFonts w:ascii="Calibri" w:hAnsi="Calibri" w:cs="Calibri"/>
+                <w:noProof/>
+                <w:webHidden/>
               </w:rPr>
               <w:fldChar w:fldCharType="begin"/>
             </w:r>
             <w:r>
               <w:rPr>
-                <w:rStyle w:val="Hyperlink"/>
-                <w:noProof/>
-              </w:rPr>
-              <w:instrText xml:space="preserve"> </w:instrText>
-            </w:r>
-            <w:r>
-              <w:rPr>
-                <w:noProof/>
-              </w:rPr>
-              <w:instrText>HYPERLINK \l "_Toc231917843"</w:instrText>
-            </w:r>
-            <w:r>
-              <w:rPr>
-                <w:rStyle w:val="Hyperlink"/>
-                <w:noProof/>
-              </w:rPr>
-              <w:instrText xml:space="preserve"> </w:instrText>
-            </w:r>
-            <w:r>
-              <w:rPr>
-                <w:rStyle w:val="Hyperlink"/>
-                <w:noProof/>
-              </w:rPr>
-            </w:r>
-            <w:r>
-              <w:rPr>
-                <w:rStyle w:val="Hyperlink"/>
-                <w:noProof/>
+                <w:rFonts w:ascii="Calibri" w:hAnsi="Calibri" w:cs="Calibri"/>
+                <w:noProof/>
+                <w:webHidden/>
+              </w:rPr>
+              <w:instrText xml:space="preserve"> PAGEREF _Toc231917843 \h </w:instrText>
+            </w:r>
+            <w:r>
+              <w:rPr>
+                <w:rFonts w:ascii="Calibri" w:hAnsi="Calibri" w:cs="Calibri"/>
+                <w:noProof/>
+                <w:webHidden/>
+              </w:rPr>
+            </w:r>
+            <w:r>
+              <w:rPr>
+                <w:rFonts w:ascii="Calibri" w:hAnsi="Calibri" w:cs="Calibri"/>
+                <w:noProof/>
+                <w:webHidden/>
               </w:rPr>
               <w:fldChar w:fldCharType="separate"/>
             </w:r>
             <w:r>
               <w:rPr>
-                <w:rStyle w:val="Hyperlink"/>
-                <w:noProof/>
-              </w:rPr>
-              <w:t>2.3.</w:t>
-            </w:r>
-            <w:r>
-              <w:rPr>
-                <w:rFonts w:eastAsiaTheme="minorEastAsia"/>
-                <w:noProof/>
-                <w:lang w:eastAsia="pl-PL"/>
-              </w:rPr>
-              <w:tab/>
-            </w:r>
-            <w:r>
-              <w:rPr>
-                <w:rStyle w:val="Hyperlink"/>
-                <w:noProof/>
-              </w:rPr>
-              <w:t>Klasy</w:t>
-            </w:r>
-            <w:r>
-              <w:rPr>
-                <w:noProof/>
-                <w:webHidden/>
-              </w:rPr>
-              <w:tab/>
-            </w:r>
-            <w:r>
-              <w:rPr>
-                <w:noProof/>
-                <w:webHidden/>
-              </w:rPr>
-              <w:fldChar w:fldCharType="begin"/>
-            </w:r>
-            <w:r>
-              <w:rPr>
-                <w:noProof/>
-                <w:webHidden/>
-              </w:rPr>
-              <w:instrText xml:space="preserve"> PAGEREF _Toc231917843 \h </w:instrText>
-            </w:r>
-            <w:r>
-              <w:rPr>
-                <w:noProof/>
-                <w:webHidden/>
-              </w:rPr>
-            </w:r>
-            <w:r>
-              <w:rPr>
-                <w:noProof/>
-                <w:webHidden/>
-              </w:rPr>
-              <w:fldChar w:fldCharType="separate"/>
-            </w:r>
-            <w:r>
-              <w:rPr>
+                <w:rFonts w:ascii="Calibri" w:hAnsi="Calibri" w:cs="Calibri"/>
                 <w:noProof/>
                 <w:webHidden/>
               </w:rPr>
@@ -879,19 +943,13 @@
             </w:r>
             <w:r>
               <w:rPr>
+                <w:rFonts w:ascii="Calibri" w:hAnsi="Calibri" w:cs="Calibri"/>
                 <w:noProof/>
                 <w:webHidden/>
               </w:rPr>
               <w:fldChar w:fldCharType="end"/>
             </w:r>
-            <w:r>
-              <w:rPr>
-                <w:rStyle w:val="Hyperlink"/>
-                <w:noProof/>
-              </w:rPr>
-              <w:fldChar w:fldCharType="end"/>
-            </w:r>
-          </w:ins>
+          </w:hyperlink>
         </w:p>
         <w:p>
           <w:pPr>
@@ -901,111 +959,78 @@
               <w:tab w:val="right" w:leader="dot" w:pos="9062"/>
             </w:tabs>
             <w:rPr>
-              <w:ins w:id="10" w:author="Igor 183593" w:date="2026-06-09T17:17:00Z" w16du:dateUtc="2026-06-09T15:17:00Z"/>
-              <w:rFonts w:eastAsiaTheme="minorEastAsia"/>
+              <w:rFonts w:ascii="Calibri" w:eastAsiaTheme="minorEastAsia" w:hAnsi="Calibri" w:cs="Calibri"/>
               <w:noProof/>
               <w:lang w:eastAsia="pl-PL"/>
             </w:rPr>
           </w:pPr>
-          <w:ins w:id="11" w:author="Igor 183593" w:date="2026-06-09T17:17:00Z" w16du:dateUtc="2026-06-09T15:17:00Z">
+          <w:hyperlink w:anchor="_Toc231917844" w:history="1">
             <w:r>
               <w:rPr>
                 <w:rStyle w:val="Hyperlink"/>
-                <w:noProof/>
+                <w:rFonts w:ascii="Calibri" w:hAnsi="Calibri" w:cs="Calibri"/>
+                <w:noProof/>
+              </w:rPr>
+              <w:t>2.4.</w:t>
+            </w:r>
+            <w:r>
+              <w:rPr>
+                <w:rFonts w:ascii="Calibri" w:eastAsiaTheme="minorEastAsia" w:hAnsi="Calibri" w:cs="Calibri"/>
+                <w:noProof/>
+                <w:lang w:eastAsia="pl-PL"/>
+              </w:rPr>
+              <w:tab/>
+            </w:r>
+            <w:r>
+              <w:rPr>
+                <w:rStyle w:val="Hyperlink"/>
+                <w:rFonts w:ascii="Calibri" w:hAnsi="Calibri" w:cs="Calibri"/>
+                <w:noProof/>
+              </w:rPr>
+              <w:t>Hermetyzacja</w:t>
+            </w:r>
+            <w:r>
+              <w:rPr>
+                <w:rFonts w:ascii="Calibri" w:hAnsi="Calibri" w:cs="Calibri"/>
+                <w:noProof/>
+                <w:webHidden/>
+              </w:rPr>
+              <w:tab/>
+            </w:r>
+            <w:r>
+              <w:rPr>
+                <w:rFonts w:ascii="Calibri" w:hAnsi="Calibri" w:cs="Calibri"/>
+                <w:noProof/>
+                <w:webHidden/>
               </w:rPr>
               <w:fldChar w:fldCharType="begin"/>
             </w:r>
             <w:r>
               <w:rPr>
-                <w:rStyle w:val="Hyperlink"/>
-                <w:noProof/>
-              </w:rPr>
-              <w:instrText xml:space="preserve"> </w:instrText>
-            </w:r>
-            <w:r>
-              <w:rPr>
-                <w:noProof/>
-              </w:rPr>
-              <w:instrText>HYPERLINK \l "_Toc231917844"</w:instrText>
-            </w:r>
-            <w:r>
-              <w:rPr>
-                <w:rStyle w:val="Hyperlink"/>
-                <w:noProof/>
-              </w:rPr>
-              <w:instrText xml:space="preserve"> </w:instrText>
-            </w:r>
-            <w:r>
-              <w:rPr>
-                <w:rStyle w:val="Hyperlink"/>
-                <w:noProof/>
-              </w:rPr>
-            </w:r>
-            <w:r>
-              <w:rPr>
-                <w:rStyle w:val="Hyperlink"/>
-                <w:noProof/>
+                <w:rFonts w:ascii="Calibri" w:hAnsi="Calibri" w:cs="Calibri"/>
+                <w:noProof/>
+                <w:webHidden/>
+              </w:rPr>
+              <w:instrText xml:space="preserve"> PAGEREF _Toc231917844 \h </w:instrText>
+            </w:r>
+            <w:r>
+              <w:rPr>
+                <w:rFonts w:ascii="Calibri" w:hAnsi="Calibri" w:cs="Calibri"/>
+                <w:noProof/>
+                <w:webHidden/>
+              </w:rPr>
+            </w:r>
+            <w:r>
+              <w:rPr>
+                <w:rFonts w:ascii="Calibri" w:hAnsi="Calibri" w:cs="Calibri"/>
+                <w:noProof/>
+                <w:webHidden/>
               </w:rPr>
               <w:fldChar w:fldCharType="separate"/>
             </w:r>
             <w:r>
               <w:rPr>
-                <w:rStyle w:val="Hyperlink"/>
-                <w:noProof/>
-              </w:rPr>
-              <w:t>2.4.</w:t>
-            </w:r>
-            <w:r>
-              <w:rPr>
-                <w:rFonts w:eastAsiaTheme="minorEastAsia"/>
-                <w:noProof/>
-                <w:lang w:eastAsia="pl-PL"/>
-              </w:rPr>
-              <w:tab/>
-            </w:r>
-            <w:r>
-              <w:rPr>
-                <w:rStyle w:val="Hyperlink"/>
-                <w:noProof/>
-              </w:rPr>
-              <w:t>Hermetyzacja</w:t>
-            </w:r>
-            <w:r>
-              <w:rPr>
-                <w:noProof/>
-                <w:webHidden/>
-              </w:rPr>
-              <w:tab/>
-            </w:r>
-            <w:r>
-              <w:rPr>
-                <w:noProof/>
-                <w:webHidden/>
-              </w:rPr>
-              <w:fldChar w:fldCharType="begin"/>
-            </w:r>
-            <w:r>
-              <w:rPr>
-                <w:noProof/>
-                <w:webHidden/>
-              </w:rPr>
-              <w:instrText xml:space="preserve"> PAGEREF _Toc231917844 \h </w:instrText>
-            </w:r>
-            <w:r>
-              <w:rPr>
-                <w:noProof/>
-                <w:webHidden/>
-              </w:rPr>
-            </w:r>
-            <w:r>
-              <w:rPr>
-                <w:noProof/>
-                <w:webHidden/>
-              </w:rPr>
-              <w:fldChar w:fldCharType="separate"/>
-            </w:r>
-            <w:r>
-              <w:rPr>
+                <w:rFonts w:ascii="Calibri" w:hAnsi="Calibri" w:cs="Calibri"/>
                 <w:noProof/>
                 <w:webHidden/>
               </w:rPr>
@@ -1013,19 +1038,13 @@
             </w:r>
             <w:r>
               <w:rPr>
+                <w:rFonts w:ascii="Calibri" w:hAnsi="Calibri" w:cs="Calibri"/>
                 <w:noProof/>
                 <w:webHidden/>
               </w:rPr>
               <w:fldChar w:fldCharType="end"/>
             </w:r>
-            <w:r>
-              <w:rPr>
-                <w:rStyle w:val="Hyperlink"/>
-                <w:noProof/>
-              </w:rPr>
-              <w:fldChar w:fldCharType="end"/>
-            </w:r>
-          </w:ins>
+          </w:hyperlink>
         </w:p>
         <w:p>
           <w:pPr>
@@ -1035,111 +1054,78 @@
               <w:tab w:val="right" w:leader="dot" w:pos="9062"/>
             </w:tabs>
             <w:rPr>
-              <w:ins w:id="12" w:author="Igor 183593" w:date="2026-06-09T17:17:00Z" w16du:dateUtc="2026-06-09T15:17:00Z"/>
-              <w:rFonts w:eastAsiaTheme="minorEastAsia"/>
+              <w:rFonts w:ascii="Calibri" w:eastAsiaTheme="minorEastAsia" w:hAnsi="Calibri" w:cs="Calibri"/>
               <w:noProof/>
               <w:lang w:eastAsia="pl-PL"/>
             </w:rPr>
           </w:pPr>
-          <w:ins w:id="13" w:author="Igor 183593" w:date="2026-06-09T17:17:00Z" w16du:dateUtc="2026-06-09T15:17:00Z">
+          <w:hyperlink w:anchor="_Toc231917845" w:history="1">
             <w:r>
               <w:rPr>
                 <w:rStyle w:val="Hyperlink"/>
-                <w:noProof/>
+                <w:rFonts w:ascii="Calibri" w:hAnsi="Calibri" w:cs="Calibri"/>
+                <w:noProof/>
+              </w:rPr>
+              <w:t>2.5.</w:t>
+            </w:r>
+            <w:r>
+              <w:rPr>
+                <w:rFonts w:ascii="Calibri" w:eastAsiaTheme="minorEastAsia" w:hAnsi="Calibri" w:cs="Calibri"/>
+                <w:noProof/>
+                <w:lang w:eastAsia="pl-PL"/>
+              </w:rPr>
+              <w:tab/>
+            </w:r>
+            <w:r>
+              <w:rPr>
+                <w:rStyle w:val="Hyperlink"/>
+                <w:rFonts w:ascii="Calibri" w:hAnsi="Calibri" w:cs="Calibri"/>
+                <w:noProof/>
+              </w:rPr>
+              <w:t>Dziedziczenie</w:t>
+            </w:r>
+            <w:r>
+              <w:rPr>
+                <w:rFonts w:ascii="Calibri" w:hAnsi="Calibri" w:cs="Calibri"/>
+                <w:noProof/>
+                <w:webHidden/>
+              </w:rPr>
+              <w:tab/>
+            </w:r>
+            <w:r>
+              <w:rPr>
+                <w:rFonts w:ascii="Calibri" w:hAnsi="Calibri" w:cs="Calibri"/>
+                <w:noProof/>
+                <w:webHidden/>
               </w:rPr>
               <w:fldChar w:fldCharType="begin"/>
             </w:r>
             <w:r>
               <w:rPr>
-                <w:rStyle w:val="Hyperlink"/>
-                <w:noProof/>
-              </w:rPr>
-              <w:instrText xml:space="preserve"> </w:instrText>
-            </w:r>
-            <w:r>
-              <w:rPr>
-                <w:noProof/>
-              </w:rPr>
-              <w:instrText>HYPERLINK \l "_Toc231917845"</w:instrText>
-            </w:r>
-            <w:r>
-              <w:rPr>
-                <w:rStyle w:val="Hyperlink"/>
-                <w:noProof/>
-              </w:rPr>
-              <w:instrText xml:space="preserve"> </w:instrText>
-            </w:r>
-            <w:r>
-              <w:rPr>
-                <w:rStyle w:val="Hyperlink"/>
-                <w:noProof/>
-              </w:rPr>
-            </w:r>
-            <w:r>
-              <w:rPr>
-                <w:rStyle w:val="Hyperlink"/>
-                <w:noProof/>
+                <w:rFonts w:ascii="Calibri" w:hAnsi="Calibri" w:cs="Calibri"/>
+                <w:noProof/>
+                <w:webHidden/>
+              </w:rPr>
+              <w:instrText xml:space="preserve"> PAGEREF _Toc231917845 \h </w:instrText>
+            </w:r>
+            <w:r>
+              <w:rPr>
+                <w:rFonts w:ascii="Calibri" w:hAnsi="Calibri" w:cs="Calibri"/>
+                <w:noProof/>
+                <w:webHidden/>
+              </w:rPr>
+            </w:r>
+            <w:r>
+              <w:rPr>
+                <w:rFonts w:ascii="Calibri" w:hAnsi="Calibri" w:cs="Calibri"/>
+                <w:noProof/>
+                <w:webHidden/>
               </w:rPr>
               <w:fldChar w:fldCharType="separate"/>
             </w:r>
             <w:r>
               <w:rPr>
-                <w:rStyle w:val="Hyperlink"/>
-                <w:noProof/>
-              </w:rPr>
-              <w:t>2.5.</w:t>
-            </w:r>
-            <w:r>
-              <w:rPr>
-                <w:rFonts w:eastAsiaTheme="minorEastAsia"/>
-                <w:noProof/>
-                <w:lang w:eastAsia="pl-PL"/>
-              </w:rPr>
-              <w:tab/>
-            </w:r>
-            <w:r>
-              <w:rPr>
-                <w:rStyle w:val="Hyperlink"/>
-                <w:noProof/>
-              </w:rPr>
-              <w:t>Dziedziczenie</w:t>
-            </w:r>
-            <w:r>
-              <w:rPr>
-                <w:noProof/>
-                <w:webHidden/>
-              </w:rPr>
-              <w:tab/>
-            </w:r>
-            <w:r>
-              <w:rPr>
-                <w:noProof/>
-                <w:webHidden/>
-              </w:rPr>
-              <w:fldChar w:fldCharType="begin"/>
-            </w:r>
-            <w:r>
-              <w:rPr>
-                <w:noProof/>
-                <w:webHidden/>
-              </w:rPr>
-              <w:instrText xml:space="preserve"> PAGEREF _Toc231917845 \h </w:instrText>
-            </w:r>
-            <w:r>
-              <w:rPr>
-                <w:noProof/>
-                <w:webHidden/>
-              </w:rPr>
-            </w:r>
-            <w:r>
-              <w:rPr>
-                <w:noProof/>
-                <w:webHidden/>
-              </w:rPr>
-              <w:fldChar w:fldCharType="separate"/>
-            </w:r>
-            <w:r>
-              <w:rPr>
+                <w:rFonts w:ascii="Calibri" w:hAnsi="Calibri" w:cs="Calibri"/>
                 <w:noProof/>
                 <w:webHidden/>
               </w:rPr>
@@ -1147,19 +1133,13 @@
             </w:r>
             <w:r>
               <w:rPr>
+                <w:rFonts w:ascii="Calibri" w:hAnsi="Calibri" w:cs="Calibri"/>
                 <w:noProof/>
                 <w:webHidden/>
               </w:rPr>
               <w:fldChar w:fldCharType="end"/>
             </w:r>
-            <w:r>
-              <w:rPr>
-                <w:rStyle w:val="Hyperlink"/>
-                <w:noProof/>
-              </w:rPr>
-              <w:fldChar w:fldCharType="end"/>
-            </w:r>
-          </w:ins>
+          </w:hyperlink>
         </w:p>
         <w:p>
           <w:pPr>
@@ -1169,111 +1149,78 @@
               <w:tab w:val="right" w:leader="dot" w:pos="9062"/>
             </w:tabs>
             <w:rPr>
-              <w:ins w:id="14" w:author="Igor 183593" w:date="2026-06-09T17:17:00Z" w16du:dateUtc="2026-06-09T15:17:00Z"/>
-              <w:rFonts w:eastAsiaTheme="minorEastAsia"/>
+              <w:rFonts w:ascii="Calibri" w:eastAsiaTheme="minorEastAsia" w:hAnsi="Calibri" w:cs="Calibri"/>
               <w:noProof/>
               <w:lang w:eastAsia="pl-PL"/>
             </w:rPr>
           </w:pPr>
-          <w:ins w:id="15" w:author="Igor 183593" w:date="2026-06-09T17:17:00Z" w16du:dateUtc="2026-06-09T15:17:00Z">
+          <w:hyperlink w:anchor="_Toc231917846" w:history="1">
             <w:r>
               <w:rPr>
                 <w:rStyle w:val="Hyperlink"/>
-                <w:noProof/>
+                <w:rFonts w:ascii="Calibri" w:hAnsi="Calibri" w:cs="Calibri"/>
+                <w:noProof/>
+              </w:rPr>
+              <w:t>2.6.</w:t>
+            </w:r>
+            <w:r>
+              <w:rPr>
+                <w:rFonts w:ascii="Calibri" w:eastAsiaTheme="minorEastAsia" w:hAnsi="Calibri" w:cs="Calibri"/>
+                <w:noProof/>
+                <w:lang w:eastAsia="pl-PL"/>
+              </w:rPr>
+              <w:tab/>
+            </w:r>
+            <w:r>
+              <w:rPr>
+                <w:rStyle w:val="Hyperlink"/>
+                <w:rFonts w:ascii="Calibri" w:hAnsi="Calibri" w:cs="Calibri"/>
+                <w:noProof/>
+              </w:rPr>
+              <w:t>Polimorfizm</w:t>
+            </w:r>
+            <w:r>
+              <w:rPr>
+                <w:rFonts w:ascii="Calibri" w:hAnsi="Calibri" w:cs="Calibri"/>
+                <w:noProof/>
+                <w:webHidden/>
+              </w:rPr>
+              <w:tab/>
+            </w:r>
+            <w:r>
+              <w:rPr>
+                <w:rFonts w:ascii="Calibri" w:hAnsi="Calibri" w:cs="Calibri"/>
+                <w:noProof/>
+                <w:webHidden/>
               </w:rPr>
               <w:fldChar w:fldCharType="begin"/>
             </w:r>
             <w:r>
               <w:rPr>
-                <w:rStyle w:val="Hyperlink"/>
-                <w:noProof/>
-              </w:rPr>
-              <w:instrText xml:space="preserve"> </w:instrText>
-            </w:r>
-            <w:r>
-              <w:rPr>
-                <w:noProof/>
-              </w:rPr>
-              <w:instrText>HYPERLINK \l "_Toc231917846"</w:instrText>
-            </w:r>
-            <w:r>
-              <w:rPr>
-                <w:rStyle w:val="Hyperlink"/>
-                <w:noProof/>
-              </w:rPr>
-              <w:instrText xml:space="preserve"> </w:instrText>
-            </w:r>
-            <w:r>
-              <w:rPr>
-                <w:rStyle w:val="Hyperlink"/>
-                <w:noProof/>
-              </w:rPr>
-            </w:r>
-            <w:r>
-              <w:rPr>
-                <w:rStyle w:val="Hyperlink"/>
-                <w:noProof/>
+                <w:rFonts w:ascii="Calibri" w:hAnsi="Calibri" w:cs="Calibri"/>
+                <w:noProof/>
+                <w:webHidden/>
+              </w:rPr>
+              <w:instrText xml:space="preserve"> PAGEREF _Toc231917846 \h </w:instrText>
+            </w:r>
+            <w:r>
+              <w:rPr>
+                <w:rFonts w:ascii="Calibri" w:hAnsi="Calibri" w:cs="Calibri"/>
+                <w:noProof/>
+                <w:webHidden/>
+              </w:rPr>
+            </w:r>
+            <w:r>
+              <w:rPr>
+                <w:rFonts w:ascii="Calibri" w:hAnsi="Calibri" w:cs="Calibri"/>
+                <w:noProof/>
+                <w:webHidden/>
               </w:rPr>
               <w:fldChar w:fldCharType="separate"/>
             </w:r>
             <w:r>
               <w:rPr>
-                <w:rStyle w:val="Hyperlink"/>
-                <w:noProof/>
-              </w:rPr>
-              <w:t>2.6.</w:t>
-            </w:r>
-            <w:r>
-              <w:rPr>
-                <w:rFonts w:eastAsiaTheme="minorEastAsia"/>
-                <w:noProof/>
-                <w:lang w:eastAsia="pl-PL"/>
-              </w:rPr>
-              <w:tab/>
-            </w:r>
-            <w:r>
-              <w:rPr>
-                <w:rStyle w:val="Hyperlink"/>
-                <w:noProof/>
-              </w:rPr>
-              <w:t>Polimorfizm</w:t>
-            </w:r>
-            <w:r>
-              <w:rPr>
-                <w:noProof/>
-                <w:webHidden/>
-              </w:rPr>
-              <w:tab/>
-            </w:r>
-            <w:r>
-              <w:rPr>
-                <w:noProof/>
-                <w:webHidden/>
-              </w:rPr>
-              <w:fldChar w:fldCharType="begin"/>
-            </w:r>
-            <w:r>
-              <w:rPr>
-                <w:noProof/>
-                <w:webHidden/>
-              </w:rPr>
-              <w:instrText xml:space="preserve"> PAGEREF _Toc231917846 \h </w:instrText>
-            </w:r>
-            <w:r>
-              <w:rPr>
-                <w:noProof/>
-                <w:webHidden/>
-              </w:rPr>
-            </w:r>
-            <w:r>
-              <w:rPr>
-                <w:noProof/>
-                <w:webHidden/>
-              </w:rPr>
-              <w:fldChar w:fldCharType="separate"/>
-            </w:r>
-            <w:r>
-              <w:rPr>
+                <w:rFonts w:ascii="Calibri" w:hAnsi="Calibri" w:cs="Calibri"/>
                 <w:noProof/>
                 <w:webHidden/>
               </w:rPr>
@@ -1281,19 +1228,13 @@
             </w:r>
             <w:r>
               <w:rPr>
+                <w:rFonts w:ascii="Calibri" w:hAnsi="Calibri" w:cs="Calibri"/>
                 <w:noProof/>
                 <w:webHidden/>
               </w:rPr>
               <w:fldChar w:fldCharType="end"/>
             </w:r>
-            <w:r>
-              <w:rPr>
-                <w:rStyle w:val="Hyperlink"/>
-                <w:noProof/>
-              </w:rPr>
-              <w:fldChar w:fldCharType="end"/>
-            </w:r>
-          </w:ins>
+          </w:hyperlink>
         </w:p>
         <w:p>
           <w:pPr>
@@ -1303,111 +1244,78 @@
               <w:tab w:val="right" w:leader="dot" w:pos="9062"/>
             </w:tabs>
             <w:rPr>
-              <w:ins w:id="16" w:author="Igor 183593" w:date="2026-06-09T17:17:00Z" w16du:dateUtc="2026-06-09T15:17:00Z"/>
-              <w:rFonts w:eastAsiaTheme="minorEastAsia"/>
+              <w:rFonts w:ascii="Calibri" w:eastAsiaTheme="minorEastAsia" w:hAnsi="Calibri" w:cs="Calibri"/>
               <w:noProof/>
               <w:lang w:eastAsia="pl-PL"/>
             </w:rPr>
           </w:pPr>
-          <w:ins w:id="17" w:author="Igor 183593" w:date="2026-06-09T17:17:00Z" w16du:dateUtc="2026-06-09T15:17:00Z">
+          <w:hyperlink w:anchor="_Toc231917847" w:history="1">
             <w:r>
               <w:rPr>
                 <w:rStyle w:val="Hyperlink"/>
-                <w:noProof/>
+                <w:rFonts w:ascii="Calibri" w:hAnsi="Calibri" w:cs="Calibri"/>
+                <w:noProof/>
+              </w:rPr>
+              <w:t>3.</w:t>
+            </w:r>
+            <w:r>
+              <w:rPr>
+                <w:rFonts w:ascii="Calibri" w:eastAsiaTheme="minorEastAsia" w:hAnsi="Calibri" w:cs="Calibri"/>
+                <w:noProof/>
+                <w:lang w:eastAsia="pl-PL"/>
+              </w:rPr>
+              <w:tab/>
+            </w:r>
+            <w:r>
+              <w:rPr>
+                <w:rStyle w:val="Hyperlink"/>
+                <w:rFonts w:ascii="Calibri" w:hAnsi="Calibri" w:cs="Calibri"/>
+                <w:noProof/>
+              </w:rPr>
+              <w:t>Wnioski</w:t>
+            </w:r>
+            <w:r>
+              <w:rPr>
+                <w:rFonts w:ascii="Calibri" w:hAnsi="Calibri" w:cs="Calibri"/>
+                <w:noProof/>
+                <w:webHidden/>
+              </w:rPr>
+              <w:tab/>
+            </w:r>
+            <w:r>
+              <w:rPr>
+                <w:rFonts w:ascii="Calibri" w:hAnsi="Calibri" w:cs="Calibri"/>
+                <w:noProof/>
+                <w:webHidden/>
               </w:rPr>
               <w:fldChar w:fldCharType="begin"/>
             </w:r>
             <w:r>
               <w:rPr>
-                <w:rStyle w:val="Hyperlink"/>
-                <w:noProof/>
-              </w:rPr>
-              <w:instrText xml:space="preserve"> </w:instrText>
-            </w:r>
-            <w:r>
-              <w:rPr>
-                <w:noProof/>
-              </w:rPr>
-              <w:instrText>HYPERLINK \l "_Toc231917847"</w:instrText>
-            </w:r>
-            <w:r>
-              <w:rPr>
-                <w:rStyle w:val="Hyperlink"/>
-                <w:noProof/>
-              </w:rPr>
-              <w:instrText xml:space="preserve"> </w:instrText>
-            </w:r>
-            <w:r>
-              <w:rPr>
-                <w:rStyle w:val="Hyperlink"/>
-                <w:noProof/>
-              </w:rPr>
-            </w:r>
-            <w:r>
-              <w:rPr>
-                <w:rStyle w:val="Hyperlink"/>
-                <w:noProof/>
+                <w:rFonts w:ascii="Calibri" w:hAnsi="Calibri" w:cs="Calibri"/>
+                <w:noProof/>
+                <w:webHidden/>
+              </w:rPr>
+              <w:instrText xml:space="preserve"> PAGEREF _Toc231917847 \h </w:instrText>
+            </w:r>
+            <w:r>
+              <w:rPr>
+                <w:rFonts w:ascii="Calibri" w:hAnsi="Calibri" w:cs="Calibri"/>
+                <w:noProof/>
+                <w:webHidden/>
+              </w:rPr>
+            </w:r>
+            <w:r>
+              <w:rPr>
+                <w:rFonts w:ascii="Calibri" w:hAnsi="Calibri" w:cs="Calibri"/>
+                <w:noProof/>
+                <w:webHidden/>
               </w:rPr>
               <w:fldChar w:fldCharType="separate"/>
             </w:r>
             <w:r>
               <w:rPr>
-                <w:rStyle w:val="Hyperlink"/>
-                <w:noProof/>
-              </w:rPr>
-              <w:t>3.</w:t>
-            </w:r>
-            <w:r>
-              <w:rPr>
-                <w:rFonts w:eastAsiaTheme="minorEastAsia"/>
-                <w:noProof/>
-                <w:lang w:eastAsia="pl-PL"/>
-              </w:rPr>
-              <w:tab/>
-            </w:r>
-            <w:r>
-              <w:rPr>
-                <w:rStyle w:val="Hyperlink"/>
-                <w:noProof/>
-              </w:rPr>
-              <w:t>Wnioski</w:t>
-            </w:r>
-            <w:r>
-              <w:rPr>
-                <w:noProof/>
-                <w:webHidden/>
-              </w:rPr>
-              <w:tab/>
-            </w:r>
-            <w:r>
-              <w:rPr>
-                <w:noProof/>
-                <w:webHidden/>
-              </w:rPr>
-              <w:fldChar w:fldCharType="begin"/>
-            </w:r>
-            <w:r>
-              <w:rPr>
-                <w:noProof/>
-                <w:webHidden/>
-              </w:rPr>
-              <w:instrText xml:space="preserve"> PAGEREF _Toc231917847 \h </w:instrText>
-            </w:r>
-            <w:r>
-              <w:rPr>
-                <w:noProof/>
-                <w:webHidden/>
-              </w:rPr>
-            </w:r>
-            <w:r>
-              <w:rPr>
-                <w:noProof/>
-                <w:webHidden/>
-              </w:rPr>
-              <w:fldChar w:fldCharType="separate"/>
-            </w:r>
-            <w:r>
-              <w:rPr>
+                <w:rFonts w:ascii="Calibri" w:hAnsi="Calibri" w:cs="Calibri"/>
                 <w:noProof/>
                 <w:webHidden/>
               </w:rPr>
@@ -1415,503 +1323,24 @@
             </w:r>
             <w:r>
               <w:rPr>
+                <w:rFonts w:ascii="Calibri" w:hAnsi="Calibri" w:cs="Calibri"/>
                 <w:noProof/>
                 <w:webHidden/>
               </w:rPr>
               <w:fldChar w:fldCharType="end"/>
             </w:r>
-            <w:r>
-              <w:rPr>
-                <w:rStyle w:val="Hyperlink"/>
-                <w:noProof/>
-              </w:rPr>
-              <w:fldChar w:fldCharType="end"/>
-            </w:r>
-          </w:ins>
-        </w:p>
-        <w:p>
-          <w:pPr>
-            <w:pStyle w:val="TOC1"/>
-            <w:tabs>
-              <w:tab w:val="left" w:pos="480"/>
-              <w:tab w:val="right" w:leader="dot" w:pos="9062"/>
-            </w:tabs>
-            <w:rPr>
-              <w:del w:id="18" w:author="Igor 183593" w:date="2026-06-09T17:17:00Z" w16du:dateUtc="2026-06-09T15:17:00Z"/>
-              <w:rFonts w:eastAsiaTheme="minorEastAsia"/>
-              <w:noProof/>
-              <w:lang w:eastAsia="pl-PL"/>
-            </w:rPr>
-          </w:pPr>
-          <w:del w:id="19" w:author="Igor 183593" w:date="2026-06-09T17:17:00Z" w16du:dateUtc="2026-06-09T15:17:00Z">
-            <w:r>
-              <w:rPr>
-                <w:rStyle w:val="Hyperlink"/>
-                <w:noProof/>
-              </w:rPr>
-              <w:delText>1.</w:delText>
-            </w:r>
-            <w:r>
-              <w:rPr>
-                <w:rFonts w:eastAsiaTheme="minorEastAsia"/>
-                <w:noProof/>
-                <w:lang w:eastAsia="pl-PL"/>
-              </w:rPr>
-              <w:tab/>
-            </w:r>
-            <w:r>
-              <w:rPr>
-                <w:rStyle w:val="Hyperlink"/>
-                <w:noProof/>
-              </w:rPr>
-              <w:delText>Opis i założenia projektu</w:delText>
-            </w:r>
-            <w:r>
-              <w:rPr>
-                <w:noProof/>
-                <w:webHidden/>
-              </w:rPr>
-              <w:tab/>
-            </w:r>
-            <w:r>
-              <w:rPr>
-                <w:noProof/>
-                <w:webHidden/>
-              </w:rPr>
-              <w:delText>3</w:delText>
-            </w:r>
-          </w:del>
-        </w:p>
-        <w:p>
-          <w:pPr>
-            <w:pStyle w:val="TOC1"/>
-            <w:tabs>
-              <w:tab w:val="left" w:pos="480"/>
-              <w:tab w:val="right" w:leader="dot" w:pos="9062"/>
-            </w:tabs>
-            <w:rPr>
-              <w:del w:id="20" w:author="Igor 183593" w:date="2026-06-09T17:17:00Z" w16du:dateUtc="2026-06-09T15:17:00Z"/>
-              <w:rFonts w:eastAsiaTheme="minorEastAsia"/>
-              <w:noProof/>
-              <w:lang w:eastAsia="pl-PL"/>
-            </w:rPr>
-          </w:pPr>
-          <w:del w:id="21" w:author="Igor 183593" w:date="2026-06-09T17:17:00Z" w16du:dateUtc="2026-06-09T15:17:00Z">
-            <w:r>
-              <w:rPr>
-                <w:rStyle w:val="Hyperlink"/>
-                <w:noProof/>
-              </w:rPr>
-              <w:delText>2.</w:delText>
-            </w:r>
-            <w:r>
-              <w:rPr>
-                <w:rFonts w:eastAsiaTheme="minorEastAsia"/>
-                <w:noProof/>
-                <w:lang w:eastAsia="pl-PL"/>
-              </w:rPr>
-              <w:tab/>
-            </w:r>
-            <w:r>
-              <w:rPr>
-                <w:rStyle w:val="Hyperlink"/>
-                <w:noProof/>
-              </w:rPr>
-              <w:delText>Opis techniczny projektu</w:delText>
-            </w:r>
-            <w:r>
-              <w:rPr>
-                <w:noProof/>
-                <w:webHidden/>
-              </w:rPr>
-              <w:tab/>
-            </w:r>
-            <w:r>
-              <w:rPr>
-                <w:noProof/>
-                <w:webHidden/>
-              </w:rPr>
-              <w:delText>4</w:delText>
-            </w:r>
-          </w:del>
-        </w:p>
-        <w:p>
-          <w:pPr>
-            <w:pStyle w:val="TOC3"/>
-            <w:tabs>
-              <w:tab w:val="left" w:pos="1200"/>
-              <w:tab w:val="right" w:leader="dot" w:pos="9062"/>
-            </w:tabs>
-            <w:rPr>
-              <w:del w:id="22" w:author="Igor 183593" w:date="2026-06-09T17:17:00Z" w16du:dateUtc="2026-06-09T15:17:00Z"/>
-              <w:rFonts w:eastAsiaTheme="minorEastAsia"/>
-              <w:noProof/>
-              <w:lang w:eastAsia="pl-PL"/>
-            </w:rPr>
-          </w:pPr>
-          <w:del w:id="23" w:author="Igor 183593" w:date="2026-06-09T17:17:00Z" w16du:dateUtc="2026-06-09T15:17:00Z">
-            <w:r>
-              <w:rPr>
-                <w:rStyle w:val="Hyperlink"/>
-                <w:noProof/>
-              </w:rPr>
-              <w:delText>2.1.</w:delText>
-            </w:r>
-            <w:r>
-              <w:rPr>
-                <w:rFonts w:eastAsiaTheme="minorEastAsia"/>
-                <w:noProof/>
-                <w:lang w:eastAsia="pl-PL"/>
-              </w:rPr>
-              <w:tab/>
-            </w:r>
-            <w:r>
-              <w:rPr>
-                <w:rStyle w:val="Hyperlink"/>
-                <w:noProof/>
-              </w:rPr>
-              <w:delText>Interfejsy</w:delText>
-            </w:r>
-            <w:r>
-              <w:rPr>
-                <w:noProof/>
-                <w:webHidden/>
-              </w:rPr>
-              <w:tab/>
-            </w:r>
-            <w:r>
-              <w:rPr>
-                <w:noProof/>
-                <w:webHidden/>
-              </w:rPr>
-              <w:delText>4</w:delText>
-            </w:r>
-          </w:del>
-        </w:p>
-        <w:p>
-          <w:pPr>
-            <w:pStyle w:val="TOC3"/>
-            <w:tabs>
-              <w:tab w:val="left" w:pos="1200"/>
-              <w:tab w:val="right" w:leader="dot" w:pos="9062"/>
-            </w:tabs>
-            <w:rPr>
-              <w:del w:id="24" w:author="Igor 183593" w:date="2026-06-09T17:17:00Z" w16du:dateUtc="2026-06-09T15:17:00Z"/>
-              <w:rFonts w:eastAsiaTheme="minorEastAsia"/>
-              <w:noProof/>
-              <w:lang w:eastAsia="pl-PL"/>
-            </w:rPr>
-          </w:pPr>
-          <w:del w:id="25" w:author="Igor 183593" w:date="2026-06-09T17:17:00Z" w16du:dateUtc="2026-06-09T15:17:00Z">
-            <w:r>
-              <w:rPr>
-                <w:rStyle w:val="Hyperlink"/>
-                <w:noProof/>
-              </w:rPr>
-              <w:delText>2.2.</w:delText>
-            </w:r>
-            <w:r>
-              <w:rPr>
-                <w:rFonts w:eastAsiaTheme="minorEastAsia"/>
-                <w:noProof/>
-                <w:lang w:eastAsia="pl-PL"/>
-              </w:rPr>
-              <w:tab/>
-            </w:r>
-            <w:r>
-              <w:rPr>
-                <w:rStyle w:val="Hyperlink"/>
-                <w:noProof/>
-              </w:rPr>
-              <w:delText>Klasy</w:delText>
-            </w:r>
-            <w:r>
-              <w:rPr>
-                <w:noProof/>
-                <w:webHidden/>
-              </w:rPr>
-              <w:tab/>
-            </w:r>
-            <w:r>
-              <w:rPr>
-                <w:noProof/>
-                <w:webHidden/>
-              </w:rPr>
-              <w:delText>4</w:delText>
-            </w:r>
-          </w:del>
-        </w:p>
-        <w:p>
-          <w:pPr>
-            <w:pStyle w:val="TOC3"/>
-            <w:tabs>
-              <w:tab w:val="left" w:pos="1200"/>
-              <w:tab w:val="right" w:leader="dot" w:pos="9062"/>
-            </w:tabs>
-            <w:rPr>
-              <w:del w:id="26" w:author="Igor 183593" w:date="2026-06-09T17:17:00Z" w16du:dateUtc="2026-06-09T15:17:00Z"/>
-              <w:rFonts w:eastAsiaTheme="minorEastAsia"/>
-              <w:noProof/>
-              <w:lang w:eastAsia="pl-PL"/>
-            </w:rPr>
-          </w:pPr>
-          <w:del w:id="27" w:author="Igor 183593" w:date="2026-06-09T17:17:00Z" w16du:dateUtc="2026-06-09T15:17:00Z">
-            <w:r>
-              <w:rPr>
-                <w:rStyle w:val="Hyperlink"/>
-                <w:noProof/>
-              </w:rPr>
-              <w:delText>2.3.</w:delText>
-            </w:r>
-            <w:r>
-              <w:rPr>
-                <w:rFonts w:eastAsiaTheme="minorEastAsia"/>
-                <w:noProof/>
-                <w:lang w:eastAsia="pl-PL"/>
-              </w:rPr>
-              <w:tab/>
-            </w:r>
-            <w:r>
-              <w:rPr>
-                <w:rStyle w:val="Hyperlink"/>
-                <w:noProof/>
-              </w:rPr>
-              <w:delText>Klasy</w:delText>
-            </w:r>
-            <w:r>
-              <w:rPr>
-                <w:noProof/>
-                <w:webHidden/>
-              </w:rPr>
-              <w:tab/>
-            </w:r>
-            <w:r>
-              <w:rPr>
-                <w:noProof/>
-                <w:webHidden/>
-              </w:rPr>
-              <w:delText>4</w:delText>
-            </w:r>
-          </w:del>
-        </w:p>
-        <w:p>
-          <w:pPr>
-            <w:pStyle w:val="TOC3"/>
-            <w:tabs>
-              <w:tab w:val="left" w:pos="1200"/>
-              <w:tab w:val="right" w:leader="dot" w:pos="9062"/>
-            </w:tabs>
-            <w:rPr>
-              <w:del w:id="28" w:author="Igor 183593" w:date="2026-06-09T17:17:00Z" w16du:dateUtc="2026-06-09T15:17:00Z"/>
-              <w:rFonts w:eastAsiaTheme="minorEastAsia"/>
-              <w:noProof/>
-              <w:lang w:eastAsia="pl-PL"/>
-            </w:rPr>
-          </w:pPr>
-          <w:del w:id="29" w:author="Igor 183593" w:date="2026-06-09T17:17:00Z" w16du:dateUtc="2026-06-09T15:17:00Z">
-            <w:r>
-              <w:rPr>
-                <w:rStyle w:val="Hyperlink"/>
-                <w:noProof/>
-              </w:rPr>
-              <w:delText>2.4.</w:delText>
-            </w:r>
-            <w:r>
-              <w:rPr>
-                <w:rFonts w:eastAsiaTheme="minorEastAsia"/>
-                <w:noProof/>
-                <w:lang w:eastAsia="pl-PL"/>
-              </w:rPr>
-              <w:tab/>
-            </w:r>
-            <w:r>
-              <w:rPr>
-                <w:rStyle w:val="Hyperlink"/>
-                <w:noProof/>
-              </w:rPr>
-              <w:delText>Hermetyzacja</w:delText>
-            </w:r>
-            <w:r>
-              <w:rPr>
-                <w:noProof/>
-                <w:webHidden/>
-              </w:rPr>
-              <w:tab/>
-            </w:r>
-            <w:r>
-              <w:rPr>
-                <w:noProof/>
-                <w:webHidden/>
-              </w:rPr>
-              <w:delText>4</w:delText>
-            </w:r>
-          </w:del>
-        </w:p>
-        <w:p>
-          <w:pPr>
-            <w:pStyle w:val="TOC3"/>
-            <w:tabs>
-              <w:tab w:val="left" w:pos="1200"/>
-              <w:tab w:val="right" w:leader="dot" w:pos="9062"/>
-            </w:tabs>
-            <w:rPr>
-              <w:del w:id="30" w:author="Igor 183593" w:date="2026-06-09T17:17:00Z" w16du:dateUtc="2026-06-09T15:17:00Z"/>
-              <w:rFonts w:eastAsiaTheme="minorEastAsia"/>
-              <w:noProof/>
-              <w:lang w:eastAsia="pl-PL"/>
-            </w:rPr>
-          </w:pPr>
-          <w:del w:id="31" w:author="Igor 183593" w:date="2026-06-09T17:17:00Z" w16du:dateUtc="2026-06-09T15:17:00Z">
-            <w:r>
-              <w:rPr>
-                <w:rStyle w:val="Hyperlink"/>
-                <w:noProof/>
-              </w:rPr>
-              <w:delText>2.5.</w:delText>
-            </w:r>
-            <w:r>
-              <w:rPr>
-                <w:rFonts w:eastAsiaTheme="minorEastAsia"/>
-                <w:noProof/>
-                <w:lang w:eastAsia="pl-PL"/>
-              </w:rPr>
-              <w:tab/>
-            </w:r>
-            <w:r>
-              <w:rPr>
-                <w:rStyle w:val="Hyperlink"/>
-                <w:noProof/>
-              </w:rPr>
-              <w:delText>Dziedziczenie</w:delText>
-            </w:r>
-            <w:r>
-              <w:rPr>
-                <w:noProof/>
-                <w:webHidden/>
-              </w:rPr>
-              <w:tab/>
-            </w:r>
-            <w:r>
-              <w:rPr>
-                <w:noProof/>
-                <w:webHidden/>
-              </w:rPr>
-              <w:delText>4</w:delText>
-            </w:r>
-          </w:del>
-        </w:p>
-        <w:p>
-          <w:pPr>
-            <w:pStyle w:val="TOC3"/>
-            <w:tabs>
-              <w:tab w:val="left" w:pos="1200"/>
-              <w:tab w:val="right" w:leader="dot" w:pos="9062"/>
-            </w:tabs>
-            <w:rPr>
-              <w:del w:id="32" w:author="Igor 183593" w:date="2026-06-09T17:17:00Z" w16du:dateUtc="2026-06-09T15:17:00Z"/>
-              <w:rFonts w:eastAsiaTheme="minorEastAsia"/>
-              <w:noProof/>
-              <w:lang w:eastAsia="pl-PL"/>
-            </w:rPr>
-          </w:pPr>
-          <w:del w:id="33" w:author="Igor 183593" w:date="2026-06-09T17:17:00Z" w16du:dateUtc="2026-06-09T15:17:00Z">
-            <w:r>
-              <w:rPr>
-                <w:rStyle w:val="Hyperlink"/>
-                <w:noProof/>
-              </w:rPr>
-              <w:delText>2.6.</w:delText>
-            </w:r>
-            <w:r>
-              <w:rPr>
-                <w:rFonts w:eastAsiaTheme="minorEastAsia"/>
-                <w:noProof/>
-                <w:lang w:eastAsia="pl-PL"/>
-              </w:rPr>
-              <w:tab/>
-            </w:r>
-            <w:r>
-              <w:rPr>
-                <w:rStyle w:val="Hyperlink"/>
-                <w:noProof/>
-              </w:rPr>
-              <w:delText>Polimorfizm</w:delText>
-            </w:r>
-            <w:r>
-              <w:rPr>
-                <w:noProof/>
-                <w:webHidden/>
-              </w:rPr>
-              <w:tab/>
-            </w:r>
-            <w:r>
-              <w:rPr>
-                <w:noProof/>
-                <w:webHidden/>
-              </w:rPr>
-              <w:delText>4</w:delText>
-            </w:r>
-          </w:del>
-        </w:p>
-        <w:p>
-          <w:pPr>
-            <w:pStyle w:val="TOC1"/>
-            <w:tabs>
-              <w:tab w:val="left" w:pos="480"/>
-              <w:tab w:val="right" w:leader="dot" w:pos="9062"/>
-            </w:tabs>
-            <w:rPr>
-              <w:del w:id="34" w:author="Igor 183593" w:date="2026-06-09T17:17:00Z" w16du:dateUtc="2026-06-09T15:17:00Z"/>
-              <w:rFonts w:eastAsiaTheme="minorEastAsia"/>
-              <w:noProof/>
-              <w:lang w:eastAsia="pl-PL"/>
-            </w:rPr>
-          </w:pPr>
-          <w:del w:id="35" w:author="Igor 183593" w:date="2026-06-09T17:17:00Z" w16du:dateUtc="2026-06-09T15:17:00Z">
-            <w:r>
-              <w:rPr>
-                <w:rStyle w:val="Hyperlink"/>
-                <w:noProof/>
-              </w:rPr>
-              <w:delText>3.</w:delText>
-            </w:r>
-            <w:r>
-              <w:rPr>
-                <w:rFonts w:eastAsiaTheme="minorEastAsia"/>
-                <w:noProof/>
-                <w:lang w:eastAsia="pl-PL"/>
-              </w:rPr>
-              <w:tab/>
-            </w:r>
-            <w:r>
-              <w:rPr>
-                <w:rStyle w:val="Hyperlink"/>
-                <w:noProof/>
-              </w:rPr>
-              <w:delText>Wnioski</w:delText>
-            </w:r>
-            <w:r>
-              <w:rPr>
-                <w:noProof/>
-                <w:webHidden/>
-              </w:rPr>
-              <w:tab/>
-            </w:r>
-            <w:r>
-              <w:rPr>
-                <w:noProof/>
-                <w:webHidden/>
-              </w:rPr>
-              <w:delText>5</w:delText>
-            </w:r>
-          </w:del>
+          </w:hyperlink>
         </w:p>
         <w:p>
           <w:pPr>
             <w:jc w:val="both"/>
+            <w:rPr>
+              <w:rFonts w:ascii="Calibri" w:hAnsi="Calibri" w:cs="Calibri"/>
+            </w:rPr>
           </w:pPr>
           <w:r>
             <w:rPr>
+              <w:rFonts w:ascii="Calibri" w:hAnsi="Calibri" w:cs="Calibri"/>
               <w:b/>
               <w:bCs/>
               <w:noProof/>
@@ -1925,7 +1354,7 @@
       <w:pPr>
         <w:jc w:val="both"/>
         <w:rPr>
-          <w:rFonts w:asciiTheme="majorHAnsi" w:eastAsiaTheme="majorEastAsia" w:hAnsiTheme="majorHAnsi" w:cstheme="majorBidi"/>
+          <w:rFonts w:ascii="Calibri" w:eastAsiaTheme="majorEastAsia" w:hAnsi="Calibri" w:cs="Calibri"/>
           <w:color w:val="0F4761" w:themeColor="accent1" w:themeShade="BF"/>
           <w:sz w:val="40"/>
           <w:szCs w:val="40"/>
@@ -1934,6 +1363,7 @@
       </w:pPr>
       <w:r>
         <w:rPr>
+          <w:rFonts w:ascii="Calibri" w:hAnsi="Calibri" w:cs="Calibri"/>
           <w:highlight w:val="lightGray"/>
         </w:rPr>
         <w:br w:type="page"/>
@@ -1947,134 +1377,196 @@
           <w:numId w:val="4"/>
         </w:numPr>
         <w:jc w:val="both"/>
-      </w:pPr>
-      <w:bookmarkStart w:id="36" w:name="_Toc231917839"/>
-      <w:r>
+        <w:rPr>
+          <w:rFonts w:ascii="Calibri" w:hAnsi="Calibri" w:cs="Calibri"/>
+          <w:sz w:val="32"/>
+          <w:szCs w:val="32"/>
+        </w:rPr>
+      </w:pPr>
+      <w:bookmarkStart w:id="0" w:name="_Toc231917839"/>
+      <w:r>
+        <w:rPr>
+          <w:rFonts w:ascii="Calibri" w:hAnsi="Calibri" w:cs="Calibri"/>
+          <w:sz w:val="32"/>
+          <w:szCs w:val="32"/>
+        </w:rPr>
         <w:lastRenderedPageBreak/>
         <w:t>Opis i założenia projektu</w:t>
       </w:r>
-      <w:bookmarkEnd w:id="36"/>
+      <w:bookmarkEnd w:id="0"/>
     </w:p>
     <w:p>
       <w:pPr>
         <w:jc w:val="both"/>
-      </w:pPr>
-      <w:r>
-        <w:t>Celem projektu było stworzenie aplikacji do monitorowania w czasie rzeczywistym zasobów systemowych (procesor i pamięć RAM) oraz kontenerami Dockera. Projekt miał na celu praktyczne zastosowanie technik programowania obiektowego w języku C#.</w:t>
+        <w:rPr>
+          <w:rFonts w:ascii="Calibri" w:hAnsi="Calibri" w:cs="Calibri"/>
+        </w:rPr>
+      </w:pPr>
+      <w:r>
+        <w:rPr>
+          <w:rFonts w:ascii="Calibri" w:hAnsi="Calibri" w:cs="Calibri"/>
+        </w:rPr>
+        <w:t>Celem projektu było stworzenie aplikacji Hardware Usage Monitor, służącej do bieżącego monitorowania zasobów systemowych oraz wyświetlania informacji o uruchomionych kontenerach Docker. Projekt umożliwił zastosowanie w praktyce zagadnień związanych z programowaniem obiektowym w języku C#, takich jak podział odpowiedzialności pomiędzy klasy, enkapsulacja oraz organizacja kodu aplikacji.</w:t>
       </w:r>
     </w:p>
     <w:p>
       <w:pPr>
         <w:jc w:val="both"/>
+        <w:rPr>
+          <w:rFonts w:ascii="Calibri" w:hAnsi="Calibri" w:cs="Calibri"/>
+        </w:rPr>
       </w:pPr>
     </w:p>
     <w:p>
       <w:pPr>
         <w:pStyle w:val="Title"/>
-        <w:jc w:val="both"/>
-      </w:pPr>
-      <w:r>
+        <w:rPr>
+          <w:rFonts w:ascii="Calibri" w:hAnsi="Calibri" w:cs="Calibri"/>
+          <w:sz w:val="28"/>
+          <w:szCs w:val="28"/>
+        </w:rPr>
+      </w:pPr>
+      <w:r>
+        <w:rPr>
+          <w:rFonts w:ascii="Calibri" w:hAnsi="Calibri" w:cs="Calibri"/>
+          <w:sz w:val="28"/>
+          <w:szCs w:val="28"/>
+        </w:rPr>
         <w:t>Założenia</w:t>
       </w:r>
     </w:p>
     <w:p>
       <w:pPr>
-        <w:jc w:val="both"/>
-      </w:pPr>
-      <w:r>
-        <w:rPr>
+        <w:rPr>
+          <w:rFonts w:ascii="Calibri" w:hAnsi="Calibri" w:cs="Calibri"/>
+        </w:rPr>
+      </w:pPr>
+      <w:r>
+        <w:rPr>
+          <w:rFonts w:ascii="Calibri" w:hAnsi="Calibri" w:cs="Calibri"/>
           <w:b/>
           <w:bCs/>
         </w:rPr>
         <w:t>Interface graficzny</w:t>
       </w:r>
       <w:r>
+        <w:rPr>
+          <w:rFonts w:ascii="Calibri" w:hAnsi="Calibri" w:cs="Calibri"/>
+        </w:rPr>
         <w:t xml:space="preserve"> – zamiast aplikacji konsolowej, został stworzony prosty interface graficzny z wykorzystaniem Avalalonia UI, </w:t>
       </w:r>
       <w:r>
+        <w:rPr>
+          <w:rFonts w:ascii="Calibri" w:hAnsi="Calibri" w:cs="Calibri"/>
+        </w:rPr>
         <w:t xml:space="preserve">przez co aplikacja może być rozwijana nie tylko na Windows, ale także na systemach z rodzin Linux oraz </w:t>
       </w:r>
       <w:r>
+        <w:rPr>
+          <w:rFonts w:ascii="Calibri" w:hAnsi="Calibri" w:cs="Calibri"/>
+        </w:rPr>
         <w:t>m</w:t>
       </w:r>
       <w:r>
+        <w:rPr>
+          <w:rFonts w:ascii="Calibri" w:hAnsi="Calibri" w:cs="Calibri"/>
+        </w:rPr>
         <w:t>acOS.</w:t>
       </w:r>
     </w:p>
     <w:p>
       <w:pPr>
-        <w:jc w:val="both"/>
-      </w:pPr>
-      <w:r>
-        <w:rPr>
+        <w:rPr>
+          <w:rFonts w:ascii="Calibri" w:hAnsi="Calibri" w:cs="Calibri"/>
+        </w:rPr>
+      </w:pPr>
+      <w:r>
+        <w:rPr>
+          <w:rFonts w:ascii="Calibri" w:hAnsi="Calibri" w:cs="Calibri"/>
           <w:b/>
           <w:bCs/>
         </w:rPr>
         <w:t>Architektura MVVM (Model-View-ViewModel)</w:t>
       </w:r>
       <w:r>
+        <w:rPr>
+          <w:rFonts w:ascii="Calibri" w:hAnsi="Calibri" w:cs="Calibri"/>
+        </w:rPr>
         <w:t xml:space="preserve"> – kod został zorganizowany zgodnie ze standardem MVVM, aby oddzielic logikę pobierania i przetwarzania danych (Modele i Serwisy) od widoków (Views).</w:t>
       </w:r>
     </w:p>
     <w:p>
       <w:pPr>
-        <w:jc w:val="both"/>
-      </w:pPr>
-      <w:r>
-        <w:rPr>
+        <w:rPr>
+          <w:rFonts w:ascii="Calibri" w:hAnsi="Calibri" w:cs="Calibri"/>
+        </w:rPr>
+      </w:pPr>
+      <w:r>
+        <w:rPr>
+          <w:rFonts w:ascii="Calibri" w:hAnsi="Calibri" w:cs="Calibri"/>
           <w:b/>
           <w:bCs/>
         </w:rPr>
-        <w:t>Monitorowanie zasobów  w czasie rzeczywistym</w:t>
-      </w:r>
-      <w:r>
-        <w:rPr>
+        <w:t xml:space="preserve">Monitorowanie zasobów  w czasie rzeczywistym </w:t>
+      </w:r>
+      <w:r>
+        <w:rPr>
+          <w:rFonts w:ascii="Calibri" w:hAnsi="Calibri" w:cs="Calibri"/>
+        </w:rPr>
+        <w:t>– wykorzystanie natywnych bibliotek systemowych pozwolilo na odczytywanie zuzycia pamięci RAM i obciążenia procesora z podziałem na rdzenie (i wątki).</w:t>
+      </w:r>
+    </w:p>
+    <w:p>
+      <w:pPr>
+        <w:rPr>
+          <w:rFonts w:ascii="Calibri" w:hAnsi="Calibri" w:cs="Calibri"/>
+        </w:rPr>
+      </w:pPr>
+      <w:r>
+        <w:rPr>
+          <w:rFonts w:ascii="Calibri" w:hAnsi="Calibri" w:cs="Calibri"/>
           <w:b/>
           <w:bCs/>
         </w:rPr>
-        <w:t xml:space="preserve"> </w:t>
-      </w:r>
-      <w:r>
-        <w:t>– wykorzystanie natywnych bibliotek systemowych pozwolilo na odczytywanie zuzycia pamięci RAM i obciążenia procesora z podziałem na rdzenie (i wątki).</w:t>
-      </w:r>
-    </w:p>
-    <w:p>
-      <w:pPr>
-        <w:jc w:val="both"/>
-      </w:pPr>
-      <w:r>
-        <w:rPr>
+        <w:t>Integracja z systemem Docker</w:t>
+      </w:r>
+      <w:r>
+        <w:rPr>
+          <w:rFonts w:ascii="Calibri" w:hAnsi="Calibri" w:cs="Calibri"/>
+        </w:rPr>
+        <w:t xml:space="preserve"> – program parsuje dane z wiersza poleceń, agreguje kontenery w obrębie projektów (wg plików docker-compose.yml) i umożliwia podstawowe zarządzanie nimi (włączanie i wyłączanie) z poziomu aplikacji.</w:t>
+      </w:r>
+    </w:p>
+    <w:p>
+      <w:pPr>
+        <w:rPr>
+          <w:rFonts w:ascii="Calibri" w:hAnsi="Calibri" w:cs="Calibri"/>
+        </w:rPr>
+      </w:pPr>
+      <w:r>
+        <w:rPr>
+          <w:rFonts w:ascii="Calibri" w:hAnsi="Calibri" w:cs="Calibri"/>
           <w:b/>
           <w:bCs/>
         </w:rPr>
-        <w:t>Integracja z systemem Docker</w:t>
-      </w:r>
-      <w:r>
-        <w:t xml:space="preserve"> – program parsuje dane z wiersza poleceń, agreguje kontenery w obrębie projektów (wg plików docker-compose.yml) i umożliwia podstawowe zarządzanie nimi (włączanie i wyłączanie) z poziomu aplikacji.</w:t>
-      </w:r>
-    </w:p>
-    <w:p>
-      <w:pPr>
-        <w:jc w:val="both"/>
-      </w:pPr>
-      <w:r>
-        <w:rPr>
-          <w:b/>
-          <w:bCs/>
-        </w:rPr>
         <w:t>Cykliczne odświeżanie</w:t>
       </w:r>
       <w:r>
+        <w:rPr>
+          <w:rFonts w:ascii="Calibri" w:hAnsi="Calibri" w:cs="Calibri"/>
+        </w:rPr>
         <w:t xml:space="preserve"> – zastosowano asynchroniczne odświeżanie (</w:t>
       </w:r>
       <w:r>
         <w:rPr>
+          <w:rFonts w:ascii="Calibri" w:hAnsi="Calibri" w:cs="Calibri"/>
           <w:i/>
         </w:rPr>
         <w:t>DispatcherTimer</w:t>
       </w:r>
       <w:r>
         <w:rPr>
+          <w:rFonts w:ascii="Calibri" w:hAnsi="Calibri" w:cs="Calibri"/>
           <w:b/>
           <w:bCs/>
           <w:iCs/>
@@ -2083,17 +1575,22 @@
       </w:r>
       <w:r>
         <w:rPr>
+          <w:rFonts w:ascii="Calibri" w:hAnsi="Calibri" w:cs="Calibri"/>
           <w:iCs/>
         </w:rPr>
         <w:t xml:space="preserve">oraz </w:t>
       </w:r>
       <w:r>
         <w:rPr>
+          <w:rFonts w:ascii="Calibri" w:hAnsi="Calibri" w:cs="Calibri"/>
           <w:i/>
         </w:rPr>
         <w:t>Task</w:t>
       </w:r>
       <w:r>
+        <w:rPr>
+          <w:rFonts w:ascii="Calibri" w:hAnsi="Calibri" w:cs="Calibri"/>
+        </w:rPr>
         <w:t>), co umożliwia ciągłe wyświetlanie aktualnych danych przy zachowaniu płynności interface’u.</w:t>
       </w:r>
     </w:p>
@@ -2101,13 +1598,16 @@
       <w:pPr>
         <w:jc w:val="both"/>
         <w:rPr>
-          <w:rFonts w:asciiTheme="majorHAnsi" w:eastAsiaTheme="majorEastAsia" w:hAnsiTheme="majorHAnsi" w:cstheme="majorBidi"/>
+          <w:rFonts w:ascii="Calibri" w:eastAsiaTheme="majorEastAsia" w:hAnsi="Calibri" w:cs="Calibri"/>
           <w:color w:val="0F4761" w:themeColor="accent1" w:themeShade="BF"/>
           <w:sz w:val="40"/>
           <w:szCs w:val="40"/>
         </w:rPr>
       </w:pPr>
       <w:r>
+        <w:rPr>
+          <w:rFonts w:ascii="Calibri" w:hAnsi="Calibri" w:cs="Calibri"/>
+        </w:rPr>
         <w:br w:type="page"/>
       </w:r>
     </w:p>
@@ -2118,20 +1618,34 @@
           <w:ilvl w:val="0"/>
           <w:numId w:val="4"/>
         </w:numPr>
-        <w:jc w:val="both"/>
-      </w:pPr>
-      <w:bookmarkStart w:id="37" w:name="_Toc231917840"/>
-      <w:r>
+        <w:rPr>
+          <w:rFonts w:ascii="Calibri" w:hAnsi="Calibri" w:cs="Calibri"/>
+          <w:sz w:val="32"/>
+          <w:szCs w:val="32"/>
+        </w:rPr>
+      </w:pPr>
+      <w:bookmarkStart w:id="1" w:name="_Toc231917840"/>
+      <w:r>
+        <w:rPr>
+          <w:rFonts w:ascii="Calibri" w:hAnsi="Calibri" w:cs="Calibri"/>
+          <w:sz w:val="32"/>
+          <w:szCs w:val="32"/>
+        </w:rPr>
         <w:lastRenderedPageBreak/>
         <w:t>Opis techniczny projektu</w:t>
       </w:r>
-      <w:bookmarkEnd w:id="37"/>
-    </w:p>
-    <w:p>
-      <w:pPr>
-        <w:jc w:val="both"/>
-      </w:pPr>
-      <w:r>
+      <w:bookmarkEnd w:id="1"/>
+    </w:p>
+    <w:p>
+      <w:pPr>
+        <w:rPr>
+          <w:rFonts w:ascii="Calibri" w:hAnsi="Calibri" w:cs="Calibri"/>
+        </w:rPr>
+      </w:pPr>
+      <w:r>
+        <w:rPr>
+          <w:rFonts w:ascii="Calibri" w:hAnsi="Calibri" w:cs="Calibri"/>
+        </w:rPr>
         <w:t>Architektura aplikacji opiera sie na zasadach programowania obiektowego, zapewniając łatwość rozbudowy i utrzymania kodu. Struktura obejmuje następujące kluczowe elementy:</w:t>
       </w:r>
     </w:p>
@@ -2142,17 +1656,27 @@
           <w:ilvl w:val="1"/>
           <w:numId w:val="4"/>
         </w:numPr>
-        <w:jc w:val="both"/>
-      </w:pPr>
-      <w:bookmarkStart w:id="38" w:name="_Toc231917841"/>
+        <w:rPr>
+          <w:rFonts w:ascii="Calibri" w:hAnsi="Calibri" w:cs="Calibri"/>
+        </w:rPr>
+      </w:pPr>
+      <w:bookmarkStart w:id="2" w:name="_Toc231917841"/>
       <w:r>
         <w:rPr>
           <w:rStyle w:val="Heading3Char"/>
+          <w:rFonts w:ascii="Calibri" w:hAnsi="Calibri" w:cs="Calibri"/>
+          <w:b/>
+          <w:bCs/>
+          <w:sz w:val="24"/>
+          <w:szCs w:val="24"/>
         </w:rPr>
         <w:t>Interfejsy</w:t>
       </w:r>
-      <w:bookmarkEnd w:id="38"/>
-      <w:r>
+      <w:bookmarkEnd w:id="2"/>
+      <w:r>
+        <w:rPr>
+          <w:rFonts w:ascii="Calibri" w:hAnsi="Calibri" w:cs="Calibri"/>
+        </w:rPr>
         <w:t xml:space="preserve"> – narzucają strukture klas implementujących</w:t>
       </w:r>
     </w:p>
@@ -2163,19 +1687,30 @@
           <w:ilvl w:val="1"/>
           <w:numId w:val="5"/>
         </w:numPr>
-        <w:jc w:val="both"/>
-      </w:pPr>
-      <w:r>
-        <w:rPr>
+        <w:rPr>
+          <w:rFonts w:ascii="Calibri" w:hAnsi="Calibri" w:cs="Calibri"/>
+        </w:rPr>
+      </w:pPr>
+      <w:r>
+        <w:rPr>
+          <w:rFonts w:ascii="Calibri" w:hAnsi="Calibri" w:cs="Calibri"/>
+          <w:b/>
+          <w:bCs/>
           <w:i/>
           <w:iCs/>
         </w:rPr>
         <w:t>ISystemMonitorService</w:t>
       </w:r>
       <w:r>
+        <w:rPr>
+          <w:rFonts w:ascii="Calibri" w:hAnsi="Calibri" w:cs="Calibri"/>
+        </w:rPr>
         <w:t xml:space="preserve"> – określa metody do pobierania statystyk systemu (rdzenie CPU i RAM)</w:t>
       </w:r>
       <w:r>
+        <w:rPr>
+          <w:rFonts w:ascii="Calibri" w:hAnsi="Calibri" w:cs="Calibri"/>
+        </w:rPr>
         <w:t>.</w:t>
       </w:r>
     </w:p>
@@ -2186,19 +1721,38 @@
           <w:ilvl w:val="1"/>
           <w:numId w:val="5"/>
         </w:numPr>
-        <w:jc w:val="both"/>
-      </w:pPr>
-      <w:r>
-        <w:rPr>
+        <w:rPr>
+          <w:rFonts w:ascii="Calibri" w:hAnsi="Calibri" w:cs="Calibri"/>
+        </w:rPr>
+      </w:pPr>
+      <w:r>
+        <w:rPr>
+          <w:rFonts w:ascii="Calibri" w:hAnsi="Calibri" w:cs="Calibri"/>
+          <w:b/>
+          <w:bCs/>
           <w:i/>
           <w:iCs/>
         </w:rPr>
-        <w:t xml:space="preserve">IDockerService – </w:t>
-      </w:r>
-      <w:r>
+        <w:t>IDockerService</w:t>
+      </w:r>
+      <w:r>
+        <w:rPr>
+          <w:rFonts w:ascii="Calibri" w:hAnsi="Calibri" w:cs="Calibri"/>
+          <w:i/>
+          <w:iCs/>
+        </w:rPr>
+        <w:t xml:space="preserve"> – </w:t>
+      </w:r>
+      <w:r>
+        <w:rPr>
+          <w:rFonts w:ascii="Calibri" w:hAnsi="Calibri" w:cs="Calibri"/>
+        </w:rPr>
         <w:t>określa metody do operacji w sekcji Docker’owej</w:t>
       </w:r>
       <w:r>
+        <w:rPr>
+          <w:rFonts w:ascii="Calibri" w:hAnsi="Calibri" w:cs="Calibri"/>
+        </w:rPr>
         <w:t>.</w:t>
       </w:r>
     </w:p>
@@ -2209,22 +1763,41 @@
           <w:ilvl w:val="1"/>
           <w:numId w:val="4"/>
         </w:numPr>
-        <w:jc w:val="both"/>
-      </w:pPr>
-      <w:bookmarkStart w:id="39" w:name="_Toc231917842"/>
+        <w:rPr>
+          <w:rFonts w:ascii="Calibri" w:hAnsi="Calibri" w:cs="Calibri"/>
+          <w:b/>
+          <w:bCs/>
+        </w:rPr>
+      </w:pPr>
+      <w:bookmarkStart w:id="3" w:name="_Toc231917842"/>
       <w:r>
         <w:rPr>
           <w:rStyle w:val="Heading3Char"/>
+          <w:rFonts w:ascii="Calibri" w:hAnsi="Calibri" w:cs="Calibri"/>
+          <w:b/>
+          <w:bCs/>
+          <w:sz w:val="24"/>
+          <w:szCs w:val="24"/>
         </w:rPr>
         <w:t>Klasy</w:t>
       </w:r>
-      <w:bookmarkEnd w:id="39"/>
-      <w:r>
+      <w:bookmarkEnd w:id="3"/>
+      <w:r>
+        <w:rPr>
+          <w:rFonts w:ascii="Calibri" w:hAnsi="Calibri" w:cs="Calibri"/>
+          <w:b/>
+          <w:bCs/>
+        </w:rPr>
         <w:t xml:space="preserve"> </w:t>
       </w:r>
       <w:r>
         <w:rPr>
           <w:rStyle w:val="Heading3Char"/>
+          <w:rFonts w:ascii="Calibri" w:hAnsi="Calibri" w:cs="Calibri"/>
+          <w:b/>
+          <w:bCs/>
+          <w:sz w:val="24"/>
+          <w:szCs w:val="24"/>
         </w:rPr>
         <w:t>abstrakcyjne</w:t>
       </w:r>
@@ -2236,26 +1809,46 @@
           <w:ilvl w:val="2"/>
           <w:numId w:val="6"/>
         </w:numPr>
-        <w:jc w:val="both"/>
-      </w:pPr>
-      <w:r>
-        <w:rPr>
+        <w:rPr>
+          <w:rFonts w:ascii="Calibri" w:hAnsi="Calibri" w:cs="Calibri"/>
+        </w:rPr>
+      </w:pPr>
+      <w:r>
+        <w:rPr>
+          <w:rFonts w:ascii="Calibri" w:hAnsi="Calibri" w:cs="Calibri"/>
+          <w:b/>
+          <w:bCs/>
           <w:i/>
           <w:iCs/>
         </w:rPr>
-        <w:t xml:space="preserve">ViewModelBase </w:t>
-      </w:r>
-      <w:r>
-        <w:t xml:space="preserve">– klasa bazowa dla wszystkich widoków-modeli (ViewModels) implementująca </w:t>
-      </w:r>
-      <w:r>
-        <w:rPr>
+        <w:t>ViewModelBase</w:t>
+      </w:r>
+      <w:r>
+        <w:rPr>
+          <w:rFonts w:ascii="Calibri" w:hAnsi="Calibri" w:cs="Calibri"/>
           <w:i/>
           <w:iCs/>
         </w:rPr>
+        <w:t xml:space="preserve"> </w:t>
+      </w:r>
+      <w:r>
+        <w:rPr>
+          <w:rFonts w:ascii="Calibri" w:hAnsi="Calibri" w:cs="Calibri"/>
+        </w:rPr>
+        <w:t xml:space="preserve">– klasa bazowa dla wszystkich widoków-modeli (ViewModels) implementująca </w:t>
+      </w:r>
+      <w:r>
+        <w:rPr>
+          <w:rFonts w:ascii="Calibri" w:hAnsi="Calibri" w:cs="Calibri"/>
+          <w:i/>
+          <w:iCs/>
+        </w:rPr>
         <w:t xml:space="preserve">INotifyPropertyChanged </w:t>
       </w:r>
       <w:r>
+        <w:rPr>
+          <w:rFonts w:ascii="Calibri" w:hAnsi="Calibri" w:cs="Calibri"/>
+        </w:rPr>
         <w:t>w celu samoisnej zmiany danych na interface.</w:t>
       </w:r>
     </w:p>
@@ -2266,16 +1859,32 @@
           <w:ilvl w:val="2"/>
           <w:numId w:val="6"/>
         </w:numPr>
-        <w:jc w:val="both"/>
-      </w:pPr>
-      <w:r>
-        <w:rPr>
+        <w:rPr>
+          <w:rFonts w:ascii="Calibri" w:hAnsi="Calibri" w:cs="Calibri"/>
+        </w:rPr>
+      </w:pPr>
+      <w:r>
+        <w:rPr>
+          <w:rFonts w:ascii="Calibri" w:hAnsi="Calibri" w:cs="Calibri"/>
+          <w:b/>
+          <w:bCs/>
           <w:i/>
           <w:iCs/>
         </w:rPr>
-        <w:t xml:space="preserve">SystemMonitorServiceBase </w:t>
-      </w:r>
-      <w:r>
+        <w:t>SystemMonitorServiceBase</w:t>
+      </w:r>
+      <w:r>
+        <w:rPr>
+          <w:rFonts w:ascii="Calibri" w:hAnsi="Calibri" w:cs="Calibri"/>
+          <w:i/>
+          <w:iCs/>
+        </w:rPr>
+        <w:t xml:space="preserve"> </w:t>
+      </w:r>
+      <w:r>
+        <w:rPr>
+          <w:rFonts w:ascii="Calibri" w:hAnsi="Calibri" w:cs="Calibri"/>
+        </w:rPr>
         <w:t>– zapewnia wspólną logikę oraz mechanizmy dla róznych implementacji monitorowania sprzętu.</w:t>
       </w:r>
     </w:p>
@@ -2286,22 +1895,33 @@
           <w:ilvl w:val="1"/>
           <w:numId w:val="4"/>
         </w:numPr>
-        <w:jc w:val="both"/>
-      </w:pPr>
-      <w:bookmarkStart w:id="40" w:name="_Toc231917843"/>
+        <w:rPr>
+          <w:rFonts w:ascii="Calibri" w:hAnsi="Calibri" w:cs="Calibri"/>
+        </w:rPr>
+      </w:pPr>
+      <w:bookmarkStart w:id="4" w:name="_Toc231917843"/>
       <w:r>
         <w:rPr>
           <w:rStyle w:val="Heading3Char"/>
+          <w:rFonts w:ascii="Calibri" w:hAnsi="Calibri" w:cs="Calibri"/>
+          <w:sz w:val="24"/>
+          <w:szCs w:val="24"/>
         </w:rPr>
         <w:t>Klasy</w:t>
       </w:r>
-      <w:bookmarkEnd w:id="40"/>
-      <w:r>
+      <w:bookmarkEnd w:id="4"/>
+      <w:r>
+        <w:rPr>
+          <w:rFonts w:ascii="Calibri" w:hAnsi="Calibri" w:cs="Calibri"/>
+        </w:rPr>
         <w:t xml:space="preserve"> </w:t>
       </w:r>
       <w:r>
         <w:rPr>
           <w:rStyle w:val="Heading3Char"/>
+          <w:rFonts w:ascii="Calibri" w:hAnsi="Calibri" w:cs="Calibri"/>
+          <w:sz w:val="24"/>
+          <w:szCs w:val="24"/>
         </w:rPr>
         <w:t>finalne</w:t>
       </w:r>
@@ -2313,43 +1933,113 @@
           <w:ilvl w:val="2"/>
           <w:numId w:val="4"/>
         </w:numPr>
-        <w:jc w:val="both"/>
-        <w:rPr>
+        <w:rPr>
+          <w:rFonts w:ascii="Calibri" w:hAnsi="Calibri" w:cs="Calibri"/>
           <w:i/>
           <w:iCs/>
           <w:lang w:val="en-US"/>
         </w:rPr>
       </w:pPr>
-      <w:r>
-        <w:rPr>
+      <w:proofErr w:type="spellStart"/>
+      <w:r>
+        <w:rPr>
+          <w:rFonts w:ascii="Calibri" w:hAnsi="Calibri" w:cs="Calibri"/>
+          <w:b/>
+          <w:bCs/>
           <w:i/>
           <w:iCs/>
           <w:lang w:val="en-US"/>
         </w:rPr>
-        <w:t xml:space="preserve">WindowsSystemMonitorService </w:t>
-      </w:r>
-      <w:r>
-        <w:rPr>
-          <w:lang w:val="en-US"/>
-        </w:rPr>
-        <w:t xml:space="preserve">– ipmlementacja </w:t>
-      </w:r>
-      <w:r>
-        <w:rPr>
+        <w:t>WindowsSystemMonitorService</w:t>
+      </w:r>
+      <w:proofErr w:type="spellEnd"/>
+      <w:r>
+        <w:rPr>
+          <w:rFonts w:ascii="Calibri" w:hAnsi="Calibri" w:cs="Calibri"/>
           <w:i/>
           <w:iCs/>
           <w:lang w:val="en-US"/>
         </w:rPr>
+        <w:t xml:space="preserve"> </w:t>
+      </w:r>
+      <w:r>
+        <w:rPr>
+          <w:rFonts w:ascii="Calibri" w:hAnsi="Calibri" w:cs="Calibri"/>
+          <w:lang w:val="en-US"/>
+        </w:rPr>
+        <w:t xml:space="preserve">– </w:t>
+      </w:r>
+      <w:proofErr w:type="spellStart"/>
+      <w:r>
+        <w:rPr>
+          <w:rFonts w:ascii="Calibri" w:hAnsi="Calibri" w:cs="Calibri"/>
+          <w:lang w:val="en-US"/>
+        </w:rPr>
+        <w:t>implementacja</w:t>
+      </w:r>
+      <w:proofErr w:type="spellEnd"/>
+      <w:r>
+        <w:rPr>
+          <w:rFonts w:ascii="Calibri" w:hAnsi="Calibri" w:cs="Calibri"/>
+          <w:lang w:val="en-US"/>
+        </w:rPr>
+        <w:t xml:space="preserve"> </w:t>
+      </w:r>
+      <w:proofErr w:type="spellStart"/>
+      <w:proofErr w:type="gramStart"/>
+      <w:r>
+        <w:rPr>
+          <w:rFonts w:ascii="Calibri" w:hAnsi="Calibri" w:cs="Calibri"/>
+          <w:i/>
+          <w:iCs/>
+          <w:lang w:val="en-US"/>
+        </w:rPr>
         <w:t>SystemMonitorServiceBase</w:t>
       </w:r>
-      <w:r>
-        <w:rPr>
+      <w:proofErr w:type="spellEnd"/>
+      <w:r>
+        <w:rPr>
+          <w:rFonts w:ascii="Calibri" w:hAnsi="Calibri" w:cs="Calibri"/>
           <w:lang w:val="en-US"/>
         </w:rPr>
-        <w:t xml:space="preserve">  dla systemu Windows</w:t>
-      </w:r>
-      <w:r>
-        <w:rPr>
+        <w:t xml:space="preserve">  </w:t>
+      </w:r>
+      <w:proofErr w:type="spellStart"/>
+      <w:r>
+        <w:rPr>
+          <w:rFonts w:ascii="Calibri" w:hAnsi="Calibri" w:cs="Calibri"/>
+          <w:lang w:val="en-US"/>
+        </w:rPr>
+        <w:t>dla</w:t>
+      </w:r>
+      <w:proofErr w:type="spellEnd"/>
+      <w:proofErr w:type="gramEnd"/>
+      <w:r>
+        <w:rPr>
+          <w:rFonts w:ascii="Calibri" w:hAnsi="Calibri" w:cs="Calibri"/>
+          <w:lang w:val="en-US"/>
+        </w:rPr>
+        <w:t xml:space="preserve"> </w:t>
+      </w:r>
+      <w:proofErr w:type="spellStart"/>
+      <w:r>
+        <w:rPr>
+          <w:rFonts w:ascii="Calibri" w:hAnsi="Calibri" w:cs="Calibri"/>
+          <w:lang w:val="en-US"/>
+        </w:rPr>
+        <w:t>systemu</w:t>
+      </w:r>
+      <w:proofErr w:type="spellEnd"/>
+      <w:r>
+        <w:rPr>
+          <w:rFonts w:ascii="Calibri" w:hAnsi="Calibri" w:cs="Calibri"/>
+          <w:lang w:val="en-US"/>
+        </w:rPr>
+        <w:t xml:space="preserve"> Windows</w:t>
+      </w:r>
+      <w:r>
+        <w:rPr>
+          <w:rFonts w:ascii="Calibri" w:hAnsi="Calibri" w:cs="Calibri"/>
           <w:lang w:val="en-US"/>
         </w:rPr>
         <w:t>.</w:t>
@@ -2362,20 +2052,33 @@
           <w:ilvl w:val="2"/>
           <w:numId w:val="4"/>
         </w:numPr>
-        <w:jc w:val="both"/>
-      </w:pPr>
-      <w:r>
-        <w:rPr>
+        <w:rPr>
+          <w:rFonts w:ascii="Calibri" w:hAnsi="Calibri" w:cs="Calibri"/>
+        </w:rPr>
+      </w:pPr>
+      <w:r>
+        <w:rPr>
+          <w:rFonts w:ascii="Calibri" w:hAnsi="Calibri" w:cs="Calibri"/>
+          <w:b/>
+          <w:bCs/>
           <w:i/>
           <w:iCs/>
         </w:rPr>
-        <w:t xml:space="preserve">DockerCliService </w:t>
-      </w:r>
-      <w:r>
-        <w:t xml:space="preserve"> - implementacja wywołująca polecenia </w:t>
-      </w:r>
-      <w:r>
-        <w:t>dla Docker.</w:t>
+        <w:t>DockerCliService</w:t>
+      </w:r>
+      <w:r>
+        <w:rPr>
+          <w:rFonts w:ascii="Calibri" w:hAnsi="Calibri" w:cs="Calibri"/>
+          <w:i/>
+          <w:iCs/>
+        </w:rPr>
+        <w:t xml:space="preserve"> </w:t>
+      </w:r>
+      <w:r>
+        <w:rPr>
+          <w:rFonts w:ascii="Calibri" w:hAnsi="Calibri" w:cs="Calibri"/>
+        </w:rPr>
+        <w:t xml:space="preserve"> - implementacja wywołująca polecenia dla Docker.</w:t>
       </w:r>
     </w:p>
     <w:p>
@@ -2385,27 +2088,41 @@
           <w:ilvl w:val="1"/>
           <w:numId w:val="4"/>
         </w:numPr>
-        <w:jc w:val="both"/>
-      </w:pPr>
-      <w:bookmarkStart w:id="41" w:name="_Toc231917844"/>
+        <w:rPr>
+          <w:rFonts w:ascii="Calibri" w:hAnsi="Calibri" w:cs="Calibri"/>
+        </w:rPr>
+      </w:pPr>
+      <w:bookmarkStart w:id="5" w:name="_Toc231917844"/>
       <w:r>
         <w:rPr>
           <w:rStyle w:val="Heading3Char"/>
+          <w:rFonts w:ascii="Calibri" w:hAnsi="Calibri" w:cs="Calibri"/>
+          <w:b/>
+          <w:bCs/>
+          <w:sz w:val="24"/>
+          <w:szCs w:val="24"/>
         </w:rPr>
         <w:t>Hermetyzacja</w:t>
       </w:r>
-      <w:bookmarkEnd w:id="41"/>
-      <w:r>
+      <w:bookmarkEnd w:id="5"/>
+      <w:r>
+        <w:rPr>
+          <w:rFonts w:ascii="Calibri" w:hAnsi="Calibri" w:cs="Calibri"/>
+        </w:rPr>
         <w:t xml:space="preserve"> – wewnętrzny jest niedostępny do modyfikacji zzewnątrz. Klasy z grupy ViewModel (np. </w:t>
       </w:r>
       <w:r>
         <w:rPr>
+          <w:rFonts w:ascii="Calibri" w:hAnsi="Calibri" w:cs="Calibri"/>
           <w:i/>
           <w:iCs/>
         </w:rPr>
         <w:t>MainWindowViewModel</w:t>
       </w:r>
       <w:r>
+        <w:rPr>
+          <w:rFonts w:ascii="Calibri" w:hAnsi="Calibri" w:cs="Calibri"/>
+        </w:rPr>
         <w:t>) modyfikowane są przez prywatne settery i metody modyfikujące, a na zewnątrz wystawiają jedynie dane do odczytu.</w:t>
       </w:r>
     </w:p>
@@ -2416,47 +2133,69 @@
           <w:ilvl w:val="1"/>
           <w:numId w:val="4"/>
         </w:numPr>
-        <w:jc w:val="both"/>
-      </w:pPr>
-      <w:bookmarkStart w:id="42" w:name="_Toc231917845"/>
+        <w:rPr>
+          <w:rFonts w:ascii="Calibri" w:hAnsi="Calibri" w:cs="Calibri"/>
+        </w:rPr>
+      </w:pPr>
+      <w:bookmarkStart w:id="6" w:name="_Toc231917845"/>
       <w:r>
         <w:rPr>
           <w:rStyle w:val="Heading3Char"/>
+          <w:rFonts w:ascii="Calibri" w:hAnsi="Calibri" w:cs="Calibri"/>
+          <w:b/>
+          <w:bCs/>
+          <w:sz w:val="24"/>
+          <w:szCs w:val="24"/>
         </w:rPr>
         <w:t>Dziedziczenie</w:t>
       </w:r>
-      <w:bookmarkEnd w:id="42"/>
-      <w:r>
+      <w:bookmarkEnd w:id="6"/>
+      <w:r>
+        <w:rPr>
+          <w:rFonts w:ascii="Calibri" w:hAnsi="Calibri" w:cs="Calibri"/>
+        </w:rPr>
         <w:t xml:space="preserve"> – modele widoków dziedziczą cechy wspólne z klasy abstrakcyjnej </w:t>
       </w:r>
       <w:r>
         <w:rPr>
+          <w:rFonts w:ascii="Calibri" w:hAnsi="Calibri" w:cs="Calibri"/>
           <w:i/>
           <w:iCs/>
         </w:rPr>
         <w:t xml:space="preserve"> ViewModelBase</w:t>
       </w:r>
       <w:r>
+        <w:rPr>
+          <w:rFonts w:ascii="Calibri" w:hAnsi="Calibri" w:cs="Calibri"/>
+        </w:rPr>
         <w:t xml:space="preserve">. W analogiczny sposób zorganizowana została klasa </w:t>
       </w:r>
       <w:r>
         <w:rPr>
+          <w:rFonts w:ascii="Calibri" w:hAnsi="Calibri" w:cs="Calibri"/>
           <w:i/>
           <w:iCs/>
         </w:rPr>
         <w:t>WindowsSystemMonitorService</w:t>
       </w:r>
       <w:r>
+        <w:rPr>
+          <w:rFonts w:ascii="Calibri" w:hAnsi="Calibri" w:cs="Calibri"/>
+        </w:rPr>
         <w:t xml:space="preserve">, która dziedziczy po </w:t>
       </w:r>
       <w:r>
         <w:rPr>
+          <w:rFonts w:ascii="Calibri" w:hAnsi="Calibri" w:cs="Calibri"/>
           <w:i/>
           <w:iCs/>
         </w:rPr>
         <w:t>SystemMonitorServiceBase</w:t>
       </w:r>
       <w:r>
+        <w:rPr>
+          <w:rFonts w:ascii="Calibri" w:hAnsi="Calibri" w:cs="Calibri"/>
+        </w:rPr>
         <w:t>.</w:t>
       </w:r>
     </w:p>
@@ -2467,22 +2206,40 @@
           <w:ilvl w:val="1"/>
           <w:numId w:val="4"/>
         </w:numPr>
-        <w:jc w:val="both"/>
-      </w:pPr>
-      <w:bookmarkStart w:id="43" w:name="_Toc231917846"/>
+        <w:rPr>
+          <w:rFonts w:ascii="Calibri" w:hAnsi="Calibri" w:cs="Calibri"/>
+        </w:rPr>
+      </w:pPr>
+      <w:bookmarkStart w:id="7" w:name="_Toc231917846"/>
       <w:r>
         <w:rPr>
           <w:rStyle w:val="Heading3Char"/>
+          <w:rFonts w:ascii="Calibri" w:hAnsi="Calibri" w:cs="Calibri"/>
+          <w:b/>
+          <w:bCs/>
+          <w:sz w:val="24"/>
+          <w:szCs w:val="24"/>
         </w:rPr>
         <w:t>Polimorfizm</w:t>
       </w:r>
-      <w:bookmarkEnd w:id="43"/>
-      <w:r>
+      <w:bookmarkEnd w:id="7"/>
+      <w:r>
+        <w:rPr>
+          <w:rFonts w:ascii="Calibri" w:hAnsi="Calibri" w:cs="Calibri"/>
+        </w:rPr>
         <w:t xml:space="preserve"> – klasy warstwy ViewModel kominukują się z serwisami bazując na interfejsach. Ma to na celu przygotowanie projektu pod rozszerzenie działania aplikacji na systemy inne, niż Windows.</w:t>
       </w:r>
     </w:p>
     <w:p>
-      <w:r>
+      <w:pPr>
+        <w:rPr>
+          <w:rFonts w:ascii="Calibri" w:hAnsi="Calibri" w:cs="Calibri"/>
+        </w:rPr>
+      </w:pPr>
+      <w:r>
+        <w:rPr>
+          <w:rFonts w:ascii="Calibri" w:hAnsi="Calibri" w:cs="Calibri"/>
+        </w:rPr>
         <w:br w:type="page"/>
       </w:r>
     </w:p>
@@ -2493,31 +2250,83 @@
           <w:ilvl w:val="0"/>
           <w:numId w:val="4"/>
         </w:numPr>
-      </w:pPr>
-      <w:bookmarkStart w:id="44" w:name="_Toc231917847"/>
-      <w:r>
+        <w:rPr>
+          <w:rFonts w:ascii="Calibri" w:hAnsi="Calibri" w:cs="Calibri"/>
+          <w:sz w:val="32"/>
+          <w:szCs w:val="32"/>
+        </w:rPr>
+      </w:pPr>
+      <w:bookmarkStart w:id="8" w:name="_Toc231917847"/>
+      <w:r>
+        <w:rPr>
+          <w:rFonts w:ascii="Calibri" w:hAnsi="Calibri" w:cs="Calibri"/>
+          <w:sz w:val="32"/>
+          <w:szCs w:val="32"/>
+        </w:rPr>
         <w:lastRenderedPageBreak/>
         <w:t>Wnioski</w:t>
       </w:r>
-      <w:bookmarkEnd w:id="44"/>
-    </w:p>
-    <w:p>
-      <w:pPr>
-        <w:jc w:val="both"/>
-      </w:pPr>
-      <w:r>
-        <w:t>Aplikacja udowadnia, jak zastosowanie zasad programowania obiektowego wpływa na jakość kodu oprogramowania. Zastosowanie wzorca MVVM wyraźnie oddzieliło wastwy prezentacji danych od logiki ich przetwarzania.</w:t>
-      </w:r>
-    </w:p>
-    <w:p>
-      <w:pPr>
-        <w:jc w:val="both"/>
-      </w:pPr>
-      <w:r>
-        <w:t>Dzięki konsekwentnemu stosowaniu interfejsów i warstwy abstrakcyjnej aplikacja jest elastyczna – obecnie obsługuje jedynie system Windows, ale jej budowa pozwala na proste dodanie obsługi środowisk linuxowych, czy macOS.</w:t>
-      </w:r>
-    </w:p>
-    <w:p/>
+      <w:bookmarkEnd w:id="8"/>
+    </w:p>
+    <w:p>
+      <w:pPr>
+        <w:rPr>
+          <w:rFonts w:ascii="Calibri" w:hAnsi="Calibri" w:cs="Calibri"/>
+        </w:rPr>
+      </w:pPr>
+      <w:r>
+        <w:rPr>
+          <w:rFonts w:ascii="Calibri" w:hAnsi="Calibri" w:cs="Calibri"/>
+        </w:rPr>
+        <w:t>Realizacja projektu umożliwiła praktyczne wykorzystanie zagadnień związanych z programowaniem obiektowym podczas tworzenia rzeczywistej aplikacji desktopowej. Zastosowanie wzorca MVVM pozwoliło na wyraźne oddzielenie warstwy prezentacji od logiki przetwarzania danych, co przełożyło się na większą przejrzystość oraz łatwiejsze utrzymanie kodu.</w:t>
+      </w:r>
+    </w:p>
+    <w:p>
+      <w:pPr>
+        <w:rPr>
+          <w:rFonts w:ascii="Calibri" w:hAnsi="Calibri" w:cs="Calibri"/>
+        </w:rPr>
+      </w:pPr>
+      <w:r>
+        <w:rPr>
+          <w:rFonts w:ascii="Calibri" w:hAnsi="Calibri" w:cs="Calibri"/>
+        </w:rPr>
+        <w:t>Wykorzystanie interfejsów i klas abstrakcyjnych sprawiło, że aplikacja została zaprojektowana w sposób elastyczny i przygotowany do dalszego rozwoju. Mimo że obecnie obsługuje ona wyłącznie system Windows, zastosowana architektura umożliwia stosunkowo proste rozszerzenie jej działania na inne systemy operacyjne, takie jak Linux czy macOS.</w:t>
+      </w:r>
+    </w:p>
+    <w:p>
+      <w:pPr>
+        <w:rPr>
+          <w:rFonts w:ascii="Calibri" w:hAnsi="Calibri" w:cs="Calibri"/>
+        </w:rPr>
+      </w:pPr>
+      <w:r>
+        <w:rPr>
+          <w:rFonts w:ascii="Calibri" w:hAnsi="Calibri" w:cs="Calibri"/>
+        </w:rPr>
+        <w:t>Projekt pozwolił również zdobyć praktyczne doświadczenie w pracy z technologiami wykorzystywanymi we współczesnym środowisku programistycznym. Integracja z Dockerem, monitorowanie zasobów systemowych oraz zastosowanie mechanizmów asynchronicznych pokazały, jak połączyć różne obszary programowania w ramach jednego rozwiązania.</w:t>
+      </w:r>
+    </w:p>
+    <w:p>
+      <w:pPr>
+        <w:rPr>
+          <w:rFonts w:ascii="Calibri" w:hAnsi="Calibri" w:cs="Calibri"/>
+        </w:rPr>
+      </w:pPr>
+    </w:p>
+    <w:p>
+      <w:pPr>
+        <w:rPr>
+          <w:rFonts w:ascii="Calibri" w:hAnsi="Calibri" w:cs="Calibri"/>
+        </w:rPr>
+      </w:pPr>
+      <w:r>
+        <w:rPr>
+          <w:rFonts w:ascii="Calibri" w:hAnsi="Calibri" w:cs="Calibri"/>
+        </w:rPr>
+        <w:t>W przyszłości aplikacja mogłaby zostać rozbudowana o dodatkowe funkcjonalności, takie jak prezentacja historycznych danych w postaci wykresów, bardziej zaawansowane zarządzanie kontenerami Docker czy możliwość konfiguracji parametrów monitorowania przez użytkownika.</w:t>
+      </w:r>
+    </w:p>
     <w:sectPr>
       <w:pgSz w:w="11906" w:h="16838"/>
       <w:pgMar w:top="1417" w:right="1417" w:bottom="1417" w:left="1417" w:header="708" w:footer="708" w:gutter="0"/>
@@ -2581,6 +2390,119 @@
 <file path=word/numbering.xml><?xml version="1.0" encoding="utf-8"?>
 <w:numbering xmlns:wpc="http://schemas.microsoft.com/office/word/2010/wordprocessingCanvas" xmlns:cx="http://schemas.microsoft.com/office/drawing/2014/chartex" xmlns:cx1="http://schemas.microsoft.com/office/drawing/2015/9/8/chartex" xmlns:cx2="http://schemas.microsoft.com/office/drawing/2015/10/21/chartex" xmlns:cx3="http://schemas.microsoft.com/office/drawing/2016/5/9/chartex" xmlns:cx4="http://schemas.microsoft.com/office/drawing/2016/5/10/chartex" xmlns:cx5="http://schemas.microsoft.com/office/drawing/2016/5/11/chartex" xmlns:cx6="http://schemas.microsoft.com/office/drawing/2016/5/12/chartex" xmlns:cx7="http://schemas.microsoft.com/office/drawing/2016/5/13/chartex" xmlns:cx8="http://schemas.microsoft.com/office/drawing/2016/5/14/chartex" xmlns:mc="http://schemas.openxmlformats.org/markup-compatibility/2006" xmlns:aink="http://schemas.microsoft.com/office/drawing/2016/ink" xmlns:am3d="http://schemas.microsoft.com/office/drawing/2017/model3d" xmlns:o="urn:schemas-microsoft-com:office:office" xmlns:oel="http://schemas.microsoft.com/office/2019/extlst" xmlns:r="http://schemas.openxmlformats.org/officeDocument/2006/relationships" xmlns:m="http://schemas.openxmlformats.org/officeDocument/2006/math" xmlns:v="urn:schemas-microsoft-com:vml" xmlns:wp14="http://schemas.microsoft.com/office/word/2010/wordprocessingDrawing" xmlns:wp="http://schemas.openxmlformats.org/drawingml/2006/wordprocessingDrawing" xmlns:w10="urn:schemas-microsoft-com:office:word" xmlns:w="http://schemas.openxmlformats.org/wordprocessingml/2006/main" xmlns:w14="http://schemas.microsoft.com/office/word/2010/wordml" xmlns:w15="http://schemas.microsoft.com/office/word/2012/wordml" xmlns:w16cex="http://schemas.microsoft.com/office/word/2018/wordml/cex" xmlns:w16cid="http://schemas.microsoft.com/office/word/2016/wordml/cid" xmlns:w16="http://schemas.microsoft.com/office/word/2018/wordml" xmlns:w16du="http://schemas.microsoft.com/office/word/2023/wordml/word16du" xmlns:w16sdtdh="http://schemas.microsoft.com/office/word/2020/wordml/sdtdatahash" xmlns:w16sdtfl="http://schemas.microsoft.com/office/word/2024/wordml/sdtformatlock" xmlns:w16se="http://schemas.microsoft.com/office/word/2015/wordml/symex" xmlns:wpg="http://schemas.microsoft.com/office/word/2010/wordprocessingGroup" xmlns:wpi="http://schemas.microsoft.com/office/word/2010/wordprocessingInk" xmlns:wne="http://schemas.microsoft.com/office/word/2006/wordml" xmlns:wps="http://schemas.microsoft.com/office/word/2010/wordprocessingShape" mc:Ignorable="w14 w15 w16se w16cid w16 w16cex w16sdtdh w16sdtfl w16du wp14">
   <w:abstractNum w:abstractNumId="0" w15:restartNumberingAfterBreak="0">
+    <w:nsid w:val="023B3B12"/>
+    <w:multiLevelType w:val="hybridMultilevel"/>
+    <w:tmpl w:val="B8CAB864"/>
+    <w:lvl w:ilvl="0" w:tplc="04150001">
+      <w:start w:val="1"/>
+      <w:numFmt w:val="bullet"/>
+      <w:lvlText w:val=""/>
+      <w:lvlJc w:val="left"/>
+      <w:pPr>
+        <w:ind w:left="720" w:hanging="360"/>
+      </w:pPr>
+      <w:rPr>
+        <w:rFonts w:ascii="Symbol" w:hAnsi="Symbol" w:hint="default"/>
+      </w:rPr>
+    </w:lvl>
+    <w:lvl w:ilvl="1" w:tplc="04150003" w:tentative="1">
+      <w:start w:val="1"/>
+      <w:numFmt w:val="bullet"/>
+      <w:lvlText w:val="o"/>
+      <w:lvlJc w:val="left"/>
+      <w:pPr>
+        <w:ind w:left="1440" w:hanging="360"/>
+      </w:pPr>
+      <w:rPr>
+        <w:rFonts w:ascii="Courier New" w:hAnsi="Courier New" w:cs="Courier New" w:hint="default"/>
+      </w:rPr>
+    </w:lvl>
+    <w:lvl w:ilvl="2" w:tplc="04150005" w:tentative="1">
+      <w:start w:val="1"/>
+      <w:numFmt w:val="bullet"/>
+      <w:lvlText w:val=""/>
+      <w:lvlJc w:val="left"/>
+      <w:pPr>
+        <w:ind w:left="2160" w:hanging="360"/>
+      </w:pPr>
+      <w:rPr>
+        <w:rFonts w:ascii="Wingdings" w:hAnsi="Wingdings" w:hint="default"/>
+      </w:rPr>
+    </w:lvl>
+    <w:lvl w:ilvl="3" w:tplc="04150001" w:tentative="1">
+      <w:start w:val="1"/>
+      <w:numFmt w:val="bullet"/>
+      <w:lvlText w:val=""/>
+      <w:lvlJc w:val="left"/>
+      <w:pPr>
+        <w:ind w:left="2880" w:hanging="360"/>
+      </w:pPr>
+      <w:rPr>
+        <w:rFonts w:ascii="Symbol" w:hAnsi="Symbol" w:hint="default"/>
+      </w:rPr>
+    </w:lvl>
+    <w:lvl w:ilvl="4" w:tplc="04150003" w:tentative="1">
+      <w:start w:val="1"/>
+      <w:numFmt w:val="bullet"/>
+      <w:lvlText w:val="o"/>
+      <w:lvlJc w:val="left"/>
+      <w:pPr>
+        <w:ind w:left="3600" w:hanging="360"/>
+      </w:pPr>
+      <w:rPr>
+        <w:rFonts w:ascii="Courier New" w:hAnsi="Courier New" w:cs="Courier New" w:hint="default"/>
+      </w:rPr>
+    </w:lvl>
+    <w:lvl w:ilvl="5" w:tplc="04150005" w:tentative="1">
+      <w:start w:val="1"/>
+      <w:numFmt w:val="bullet"/>
+      <w:lvlText w:val=""/>
+      <w:lvlJc w:val="left"/>
+      <w:pPr>
+        <w:ind w:left="4320" w:hanging="360"/>
+      </w:pPr>
+      <w:rPr>
+        <w:rFonts w:ascii="Wingdings" w:hAnsi="Wingdings" w:hint="default"/>
+      </w:rPr>
+    </w:lvl>
+    <w:lvl w:ilvl="6" w:tplc="04150001" w:tentative="1">
+      <w:start w:val="1"/>
+      <w:numFmt w:val="bullet"/>
+      <w:lvlText w:val=""/>
+      <w:lvlJc w:val="left"/>
+      <w:pPr>
+        <w:ind w:left="5040" w:hanging="360"/>
+      </w:pPr>
+      <w:rPr>
+        <w:rFonts w:ascii="Symbol" w:hAnsi="Symbol" w:hint="default"/>
+      </w:rPr>
+    </w:lvl>
+    <w:lvl w:ilvl="7" w:tplc="04150003" w:tentative="1">
+      <w:start w:val="1"/>
+      <w:numFmt w:val="bullet"/>
+      <w:lvlText w:val="o"/>
+      <w:lvlJc w:val="left"/>
+      <w:pPr>
+        <w:ind w:left="5760" w:hanging="360"/>
+      </w:pPr>
+      <w:rPr>
+        <w:rFonts w:ascii="Courier New" w:hAnsi="Courier New" w:cs="Courier New" w:hint="default"/>
+      </w:rPr>
+    </w:lvl>
+    <w:lvl w:ilvl="8" w:tplc="04150005" w:tentative="1">
+      <w:start w:val="1"/>
+      <w:numFmt w:val="bullet"/>
+      <w:lvlText w:val=""/>
+      <w:lvlJc w:val="left"/>
+      <w:pPr>
+        <w:ind w:left="6480" w:hanging="360"/>
+      </w:pPr>
+      <w:rPr>
+        <w:rFonts w:ascii="Wingdings" w:hAnsi="Wingdings" w:hint="default"/>
+      </w:rPr>
+    </w:lvl>
+  </w:abstractNum>
+  <w:abstractNum w:abstractNumId="1" w15:restartNumberingAfterBreak="0">
     <w:nsid w:val="0782418E"/>
     <w:multiLevelType w:val="multilevel"/>
     <w:tmpl w:val="714CD1E0"/>
@@ -2709,7 +2631,93 @@
       </w:rPr>
     </w:lvl>
   </w:abstractNum>
-  <w:abstractNum w:abstractNumId="1" w15:restartNumberingAfterBreak="0">
+  <w:abstractNum w:abstractNumId="2" w15:restartNumberingAfterBreak="0">
+    <w:nsid w:val="1620700E"/>
+    <w:multiLevelType w:val="hybridMultilevel"/>
+    <w:tmpl w:val="0D08348E"/>
+    <w:lvl w:ilvl="0" w:tplc="0415000F">
+      <w:start w:val="1"/>
+      <w:numFmt w:val="decimal"/>
+      <w:lvlText w:val="%1."/>
+      <w:lvlJc w:val="left"/>
+      <w:pPr>
+        <w:ind w:left="720" w:hanging="360"/>
+      </w:pPr>
+    </w:lvl>
+    <w:lvl w:ilvl="1" w:tplc="04150019" w:tentative="1">
+      <w:start w:val="1"/>
+      <w:numFmt w:val="lowerLetter"/>
+      <w:lvlText w:val="%2."/>
+      <w:lvlJc w:val="left"/>
+      <w:pPr>
+        <w:ind w:left="1440" w:hanging="360"/>
+      </w:pPr>
+    </w:lvl>
+    <w:lvl w:ilvl="2" w:tplc="0415001B" w:tentative="1">
+      <w:start w:val="1"/>
+      <w:numFmt w:val="lowerRoman"/>
+      <w:lvlText w:val="%3."/>
+      <w:lvlJc w:val="right"/>
+      <w:pPr>
+        <w:ind w:left="2160" w:hanging="180"/>
+      </w:pPr>
+    </w:lvl>
+    <w:lvl w:ilvl="3" w:tplc="0415000F" w:tentative="1">
+      <w:start w:val="1"/>
+      <w:numFmt w:val="decimal"/>
+      <w:lvlText w:val="%4."/>
+      <w:lvlJc w:val="left"/>
+      <w:pPr>
+        <w:ind w:left="2880" w:hanging="360"/>
+      </w:pPr>
+    </w:lvl>
+    <w:lvl w:ilvl="4" w:tplc="04150019" w:tentative="1">
+      <w:start w:val="1"/>
+      <w:numFmt w:val="lowerLetter"/>
+      <w:lvlText w:val="%5."/>
+      <w:lvlJc w:val="left"/>
+      <w:pPr>
+        <w:ind w:left="3600" w:hanging="360"/>
+      </w:pPr>
+    </w:lvl>
+    <w:lvl w:ilvl="5" w:tplc="0415001B" w:tentative="1">
+      <w:start w:val="1"/>
+      <w:numFmt w:val="lowerRoman"/>
+      <w:lvlText w:val="%6."/>
+      <w:lvlJc w:val="right"/>
+      <w:pPr>
+        <w:ind w:left="4320" w:hanging="180"/>
+      </w:pPr>
+    </w:lvl>
+    <w:lvl w:ilvl="6" w:tplc="0415000F" w:tentative="1">
+      <w:start w:val="1"/>
+      <w:numFmt w:val="decimal"/>
+      <w:lvlText w:val="%7."/>
+      <w:lvlJc w:val="left"/>
+      <w:pPr>
+        <w:ind w:left="5040" w:hanging="360"/>
+      </w:pPr>
+    </w:lvl>
+    <w:lvl w:ilvl="7" w:tplc="04150019" w:tentative="1">
+      <w:start w:val="1"/>
+      <w:numFmt w:val="lowerLetter"/>
+      <w:lvlText w:val="%8."/>
+      <w:lvlJc w:val="left"/>
+      <w:pPr>
+        <w:ind w:left="5760" w:hanging="360"/>
+      </w:pPr>
+    </w:lvl>
+    <w:lvl w:ilvl="8" w:tplc="0415001B" w:tentative="1">
+      <w:start w:val="1"/>
+      <w:numFmt w:val="lowerRoman"/>
+      <w:lvlText w:val="%9."/>
+      <w:lvlJc w:val="right"/>
+      <w:pPr>
+        <w:ind w:left="6480" w:hanging="180"/>
+      </w:pPr>
+    </w:lvl>
+  </w:abstractNum>
+  <w:abstractNum w:abstractNumId="3" w15:restartNumberingAfterBreak="0">
     <w:nsid w:val="18035236"/>
     <w:multiLevelType w:val="multilevel"/>
     <w:tmpl w:val="31F6F4AE"/>
@@ -2822,7 +2830,7 @@
       </w:rPr>
     </w:lvl>
   </w:abstractNum>
-  <w:abstractNum w:abstractNumId="2" w15:restartNumberingAfterBreak="0">
+  <w:abstractNum w:abstractNumId="4" w15:restartNumberingAfterBreak="0">
     <w:nsid w:val="2DA268E0"/>
     <w:multiLevelType w:val="multilevel"/>
     <w:tmpl w:val="0792DC24"/>
@@ -2943,7 +2951,120 @@
       </w:rPr>
     </w:lvl>
   </w:abstractNum>
-  <w:abstractNum w:abstractNumId="3" w15:restartNumberingAfterBreak="0">
+  <w:abstractNum w:abstractNumId="5" w15:restartNumberingAfterBreak="0">
+    <w:nsid w:val="39733D3A"/>
+    <w:multiLevelType w:val="hybridMultilevel"/>
+    <w:tmpl w:val="26CCC176"/>
+    <w:lvl w:ilvl="0" w:tplc="04150001">
+      <w:start w:val="1"/>
+      <w:numFmt w:val="bullet"/>
+      <w:lvlText w:val=""/>
+      <w:lvlJc w:val="left"/>
+      <w:pPr>
+        <w:ind w:left="720" w:hanging="360"/>
+      </w:pPr>
+      <w:rPr>
+        <w:rFonts w:ascii="Symbol" w:hAnsi="Symbol" w:hint="default"/>
+      </w:rPr>
+    </w:lvl>
+    <w:lvl w:ilvl="1" w:tplc="04150003" w:tentative="1">
+      <w:start w:val="1"/>
+      <w:numFmt w:val="bullet"/>
+      <w:lvlText w:val="o"/>
+      <w:lvlJc w:val="left"/>
+      <w:pPr>
+        <w:ind w:left="1440" w:hanging="360"/>
+      </w:pPr>
+      <w:rPr>
+        <w:rFonts w:ascii="Courier New" w:hAnsi="Courier New" w:cs="Courier New" w:hint="default"/>
+      </w:rPr>
+    </w:lvl>
+    <w:lvl w:ilvl="2" w:tplc="04150005" w:tentative="1">
+      <w:start w:val="1"/>
+      <w:numFmt w:val="bullet"/>
+      <w:lvlText w:val=""/>
+      <w:lvlJc w:val="left"/>
+      <w:pPr>
+        <w:ind w:left="2160" w:hanging="360"/>
+      </w:pPr>
+      <w:rPr>
+        <w:rFonts w:ascii="Wingdings" w:hAnsi="Wingdings" w:hint="default"/>
+      </w:rPr>
+    </w:lvl>
+    <w:lvl w:ilvl="3" w:tplc="04150001" w:tentative="1">
+      <w:start w:val="1"/>
+      <w:numFmt w:val="bullet"/>
+      <w:lvlText w:val=""/>
+      <w:lvlJc w:val="left"/>
+      <w:pPr>
+        <w:ind w:left="2880" w:hanging="360"/>
+      </w:pPr>
+      <w:rPr>
+        <w:rFonts w:ascii="Symbol" w:hAnsi="Symbol" w:hint="default"/>
+      </w:rPr>
+    </w:lvl>
+    <w:lvl w:ilvl="4" w:tplc="04150003" w:tentative="1">
+      <w:start w:val="1"/>
+      <w:numFmt w:val="bullet"/>
+      <w:lvlText w:val="o"/>
+      <w:lvlJc w:val="left"/>
+      <w:pPr>
+        <w:ind w:left="3600" w:hanging="360"/>
+      </w:pPr>
+      <w:rPr>
+        <w:rFonts w:ascii="Courier New" w:hAnsi="Courier New" w:cs="Courier New" w:hint="default"/>
+      </w:rPr>
+    </w:lvl>
+    <w:lvl w:ilvl="5" w:tplc="04150005" w:tentative="1">
+      <w:start w:val="1"/>
+      <w:numFmt w:val="bullet"/>
+      <w:lvlText w:val=""/>
+      <w:lvlJc w:val="left"/>
+      <w:pPr>
+        <w:ind w:left="4320" w:hanging="360"/>
+      </w:pPr>
+      <w:rPr>
+        <w:rFonts w:ascii="Wingdings" w:hAnsi="Wingdings" w:hint="default"/>
+      </w:rPr>
+    </w:lvl>
+    <w:lvl w:ilvl="6" w:tplc="04150001" w:tentative="1">
+      <w:start w:val="1"/>
+      <w:numFmt w:val="bullet"/>
+      <w:lvlText w:val=""/>
+      <w:lvlJc w:val="left"/>
+      <w:pPr>
+        <w:ind w:left="5040" w:hanging="360"/>
+      </w:pPr>
+      <w:rPr>
+        <w:rFonts w:ascii="Symbol" w:hAnsi="Symbol" w:hint="default"/>
+      </w:rPr>
+    </w:lvl>
+    <w:lvl w:ilvl="7" w:tplc="04150003" w:tentative="1">
+      <w:start w:val="1"/>
+      <w:numFmt w:val="bullet"/>
+      <w:lvlText w:val="o"/>
+      <w:lvlJc w:val="left"/>
+      <w:pPr>
+        <w:ind w:left="5760" w:hanging="360"/>
+      </w:pPr>
+      <w:rPr>
+        <w:rFonts w:ascii="Courier New" w:hAnsi="Courier New" w:cs="Courier New" w:hint="default"/>
+      </w:rPr>
+    </w:lvl>
+    <w:lvl w:ilvl="8" w:tplc="04150005" w:tentative="1">
+      <w:start w:val="1"/>
+      <w:numFmt w:val="bullet"/>
+      <w:lvlText w:val=""/>
+      <w:lvlJc w:val="left"/>
+      <w:pPr>
+        <w:ind w:left="6480" w:hanging="360"/>
+      </w:pPr>
+      <w:rPr>
+        <w:rFonts w:ascii="Wingdings" w:hAnsi="Wingdings" w:hint="default"/>
+      </w:rPr>
+    </w:lvl>
+  </w:abstractNum>
+  <w:abstractNum w:abstractNumId="6" w15:restartNumberingAfterBreak="0">
     <w:nsid w:val="44070DAC"/>
     <w:multiLevelType w:val="multilevel"/>
     <w:tmpl w:val="4DCCE18C"/>
@@ -3065,7 +3186,7 @@
       </w:rPr>
     </w:lvl>
   </w:abstractNum>
-  <w:abstractNum w:abstractNumId="4" w15:restartNumberingAfterBreak="0">
+  <w:abstractNum w:abstractNumId="7" w15:restartNumberingAfterBreak="0">
     <w:nsid w:val="4E293D36"/>
     <w:multiLevelType w:val="multilevel"/>
     <w:tmpl w:val="CAA22FFA"/>
@@ -3186,7 +3307,7 @@
       </w:rPr>
     </w:lvl>
   </w:abstractNum>
-  <w:abstractNum w:abstractNumId="5" w15:restartNumberingAfterBreak="0">
+  <w:abstractNum w:abstractNumId="8" w15:restartNumberingAfterBreak="0">
     <w:nsid w:val="5F2A0D25"/>
     <w:multiLevelType w:val="hybridMultilevel"/>
     <w:tmpl w:val="61C4FE90"/>
@@ -3275,7 +3396,7 @@
       </w:pPr>
     </w:lvl>
   </w:abstractNum>
-  <w:abstractNum w:abstractNumId="6" w15:restartNumberingAfterBreak="0">
+  <w:abstractNum w:abstractNumId="9" w15:restartNumberingAfterBreak="0">
     <w:nsid w:val="623F5D07"/>
     <w:multiLevelType w:val="multilevel"/>
     <w:tmpl w:val="24D205DC"/>
@@ -3397,7 +3518,7 @@
       </w:rPr>
     </w:lvl>
   </w:abstractNum>
-  <w:abstractNum w:abstractNumId="7" w15:restartNumberingAfterBreak="0">
+  <w:abstractNum w:abstractNumId="10" w15:restartNumberingAfterBreak="0">
     <w:nsid w:val="67A3241A"/>
     <w:multiLevelType w:val="hybridMultilevel"/>
     <w:tmpl w:val="01E04C76"/>
@@ -3487,38 +3608,39 @@
     </w:lvl>
   </w:abstractNum>
   <w:num w:numId="1" w16cid:durableId="2133016405">
+    <w:abstractNumId w:val="4"/>
+  </w:num>
+  <w:num w:numId="2" w16cid:durableId="1819568608">
+    <w:abstractNumId w:val="10"/>
+  </w:num>
+  <w:num w:numId="3" w16cid:durableId="915019634">
+    <w:abstractNumId w:val="8"/>
+  </w:num>
+  <w:num w:numId="4" w16cid:durableId="2120827898">
+    <w:abstractNumId w:val="1"/>
+  </w:num>
+  <w:num w:numId="5" w16cid:durableId="364793507">
+    <w:abstractNumId w:val="7"/>
+  </w:num>
+  <w:num w:numId="6" w16cid:durableId="171146216">
+    <w:abstractNumId w:val="9"/>
+  </w:num>
+  <w:num w:numId="7" w16cid:durableId="1045790668">
+    <w:abstractNumId w:val="6"/>
+  </w:num>
+  <w:num w:numId="8" w16cid:durableId="499080819">
+    <w:abstractNumId w:val="3"/>
+  </w:num>
+  <w:num w:numId="9" w16cid:durableId="1193419791">
+    <w:abstractNumId w:val="0"/>
+  </w:num>
+  <w:num w:numId="10" w16cid:durableId="1808694877">
     <w:abstractNumId w:val="2"/>
   </w:num>
-  <w:num w:numId="2" w16cid:durableId="1819568608">
-    <w:abstractNumId w:val="7"/>
-  </w:num>
-  <w:num w:numId="3" w16cid:durableId="915019634">
+  <w:num w:numId="11" w16cid:durableId="1407412492">
     <w:abstractNumId w:val="5"/>
   </w:num>
-  <w:num w:numId="4" w16cid:durableId="2120827898">
-    <w:abstractNumId w:val="0"/>
-  </w:num>
-  <w:num w:numId="5" w16cid:durableId="364793507">
-    <w:abstractNumId w:val="4"/>
-  </w:num>
-  <w:num w:numId="6" w16cid:durableId="171146216">
-    <w:abstractNumId w:val="6"/>
-  </w:num>
-  <w:num w:numId="7" w16cid:durableId="1045790668">
-    <w:abstractNumId w:val="3"/>
-  </w:num>
-  <w:num w:numId="8" w16cid:durableId="499080819">
-    <w:abstractNumId w:val="1"/>
-  </w:num>
 </w:numbering>
-</file>
-
-<file path=word/people.xml><?xml version="1.0" encoding="utf-8"?>
-<w15:people xmlns:wpc="http://schemas.microsoft.com/office/word/2010/wordprocessingCanvas" xmlns:cx="http://schemas.microsoft.com/office/drawing/2014/chartex" xmlns:cx1="http://schemas.microsoft.com/office/drawing/2015/9/8/chartex" xmlns:cx2="http://schemas.microsoft.com/office/drawing/2015/10/21/chartex" xmlns:cx3="http://schemas.microsoft.com/office/drawing/2016/5/9/chartex" xmlns:cx4="http://schemas.microsoft.com/office/drawing/2016/5/10/chartex" xmlns:cx5="http://schemas.microsoft.com/office/drawing/2016/5/11/chartex" xmlns:cx6="http://schemas.microsoft.com/office/drawing/2016/5/12/chartex" xmlns:cx7="http://schemas.microsoft.com/office/drawing/2016/5/13/chartex" xmlns:cx8="http://schemas.microsoft.com/office/drawing/2016/5/14/chartex" xmlns:mc="http://schemas.openxmlformats.org/markup-compatibility/2006" xmlns:aink="http://schemas.microsoft.com/office/drawing/2016/ink" xmlns:am3d="http://schemas.microsoft.com/office/drawing/2017/model3d" xmlns:o="urn:schemas-microsoft-com:office:office" xmlns:oel="http://schemas.microsoft.com/office/2019/extlst" xmlns:r="http://schemas.openxmlformats.org/officeDocument/2006/relationships" xmlns:m="http://schemas.openxmlformats.org/officeDocument/2006/math" xmlns:v="urn:schemas-microsoft-com:vml" xmlns:wp14="http://schemas.microsoft.com/office/word/2010/wordprocessingDrawing" xmlns:wp="http://schemas.openxmlformats.org/drawingml/2006/wordprocessingDrawing" xmlns:w10="urn:schemas-microsoft-com:office:word" xmlns:w="http://schemas.openxmlformats.org/wordprocessingml/2006/main" xmlns:w14="http://schemas.microsoft.com/office/word/2010/wordml" xmlns:w15="http://schemas.microsoft.com/office/word/2012/wordml" xmlns:w16cex="http://schemas.microsoft.com/office/word/2018/wordml/cex" xmlns:w16cid="http://schemas.microsoft.com/office/word/2016/wordml/cid" xmlns:w16="http://schemas.microsoft.com/office/word/2018/wordml" xmlns:w16du="http://schemas.microsoft.com/office/word/2023/wordml/word16du" xmlns:w16sdtdh="http://schemas.microsoft.com/office/word/2020/wordml/sdtdatahash" xmlns:w16sdtfl="http://schemas.microsoft.com/office/word/2024/wordml/sdtformatlock" xmlns:w16se="http://schemas.microsoft.com/office/word/2015/wordml/symex" xmlns:wpg="http://schemas.microsoft.com/office/word/2010/wordprocessingGroup" xmlns:wpi="http://schemas.microsoft.com/office/word/2010/wordprocessingInk" xmlns:wne="http://schemas.microsoft.com/office/word/2006/wordml" xmlns:wps="http://schemas.microsoft.com/office/word/2010/wordprocessingShape" mc:Ignorable="w14 w15 w16se w16cid w16 w16cex w16sdtdh w16sdtfl w16du wp14">
-  <w15:person w15:author="Igor 183593">
-    <w15:presenceInfo w15:providerId="AD" w15:userId="S::chx109788@student.chorzow.merito.pl::f6efaeb0-5c8f-47ad-8413-04e640002625"/>
-  </w15:person>
-</w15:people>
 </file>
 
 <file path=word/styles.xml><?xml version="1.0" encoding="utf-8"?>
@@ -4121,7 +4243,6 @@
   <w:style w:type="character" w:default="1" w:styleId="DefaultParagraphFont">
     <w:name w:val="Default Paragraph Font"/>
     <w:uiPriority w:val="1"/>
-    <w:semiHidden/>
     <w:unhideWhenUsed/>
   </w:style>
   <w:style w:type="table" w:default="1" w:styleId="TableNormal">

</xml_diff>